<commit_message>
refactor: retain canonical testing evidence by route
</commit_message>
<xml_diff>
--- a/docs/testing/final-results/02-atomicbot-turboquant/reports/atomicbot-turboquant-report.docx
+++ b/docs/testing/final-results/02-atomicbot-turboquant/reports/atomicbot-turboquant-report.docx
@@ -13868,7 +13868,7 @@
                 <w:rFonts w:ascii="Aptos" w:hAnsi="Aptos"/>
                 <w:sz w:val="16"/>
               </w:rPr>
-              <w:t>experiments/raw-results/atomicbot-turboquant/2026-07-17/all-row-utilization-v1/AB-15M/sample-2/utilization-samples.csv</w:t>
+              <w:t>experiments/raw-results/retained/atomicbot-turboquant/2026-07-17/all-row-utilization-v1/AB-15M/sample-2/utilization-samples.csv</w:t>
             </w:r>
           </w:p>
         </w:tc>
@@ -13949,7 +13949,7 @@
                 <w:rFonts w:ascii="Aptos" w:hAnsi="Aptos"/>
                 <w:sz w:val="16"/>
               </w:rPr>
-              <w:t>experiments/raw-results/atomicbot-turboquant/2026-07-17/all-row-utilization-v1/AB-KV8-F16-4K/sample-2/utilization-samples.csv</w:t>
+              <w:t>experiments/raw-results/retained/atomicbot-turboquant/2026-07-17/all-row-utilization-v1/AB-KV8-F16-4K/sample-2/utilization-samples.csv</w:t>
             </w:r>
           </w:p>
         </w:tc>
@@ -14026,7 +14026,7 @@
                 <w:rFonts w:ascii="Aptos" w:hAnsi="Aptos"/>
                 <w:sz w:val="16"/>
               </w:rPr>
-              <w:t>experiments/raw-results/atomicbot-turboquant/2026-07-17/all-row-utilization-v1/AB-15/sample-3/utilization-samples.csv</w:t>
+              <w:t>experiments/raw-results/retained/atomicbot-turboquant/2026-07-17/all-row-utilization-v1/AB-15/sample-3/utilization-samples.csv</w:t>
             </w:r>
           </w:p>
         </w:tc>
@@ -14107,7 +14107,7 @@
                 <w:rFonts w:ascii="Aptos" w:hAnsi="Aptos"/>
                 <w:sz w:val="16"/>
               </w:rPr>
-              <w:t>experiments/raw-results/atomicbot-turboquant/2026-07-17/all-row-utilization-v1/AB-07/sample-1/utilization-samples.csv</w:t>
+              <w:t>experiments/raw-results/retained/atomicbot-turboquant/2026-07-17/all-row-utilization-v1/AB-07/sample-1/utilization-samples.csv</w:t>
             </w:r>
           </w:p>
         </w:tc>
@@ -14184,7 +14184,7 @@
                 <w:rFonts w:ascii="Aptos" w:hAnsi="Aptos"/>
                 <w:sz w:val="16"/>
               </w:rPr>
-              <w:t>experiments/raw-results/atomicbot-turboquant/2026-07-17/all-row-utilization-v1/AB-08Q/sample-2/utilization-samples.csv</w:t>
+              <w:t>experiments/raw-results/retained/atomicbot-turboquant/2026-07-17/all-row-utilization-v1/AB-08Q/sample-2/utilization-samples.csv</w:t>
             </w:r>
           </w:p>
         </w:tc>
@@ -14265,7 +14265,7 @@
                 <w:rFonts w:ascii="Aptos" w:hAnsi="Aptos"/>
                 <w:sz w:val="16"/>
               </w:rPr>
-              <w:t>experiments/raw-results/atomicbot-turboquant/2026-07-17/all-row-utilization-v1/AB-04/sample-1/utilization-samples.csv</w:t>
+              <w:t>experiments/raw-results/retained/atomicbot-turboquant/2026-07-17/all-row-utilization-v1/AB-04/sample-1/utilization-samples.csv</w:t>
             </w:r>
           </w:p>
         </w:tc>
@@ -14342,7 +14342,7 @@
                 <w:rFonts w:ascii="Aptos" w:hAnsi="Aptos"/>
                 <w:sz w:val="16"/>
               </w:rPr>
-              <w:t>experiments/raw-results/atomicbot-turboquant/2026-07-17/all-row-utilization-v1/AB-06/sample-1/utilization-samples.csv</w:t>
+              <w:t>experiments/raw-results/retained/atomicbot-turboquant/2026-07-17/all-row-utilization-v1/AB-06/sample-1/utilization-samples.csv</w:t>
             </w:r>
           </w:p>
         </w:tc>
@@ -14423,7 +14423,7 @@
                 <w:rFonts w:ascii="Aptos" w:hAnsi="Aptos"/>
                 <w:sz w:val="16"/>
               </w:rPr>
-              <w:t>experiments/raw-results/atomicbot-turboquant/2026-07-17/all-row-utilization-v1/AB-01/sample-1/utilization-samples.csv</w:t>
+              <w:t>experiments/raw-results/retained/atomicbot-turboquant/2026-07-17/all-row-utilization-v1/AB-01/sample-1/utilization-samples.csv</w:t>
             </w:r>
           </w:p>
         </w:tc>
@@ -14500,7 +14500,7 @@
                 <w:rFonts w:ascii="Aptos" w:hAnsi="Aptos"/>
                 <w:sz w:val="16"/>
               </w:rPr>
-              <w:t>experiments/raw-results/atomicbot-turboquant/2026-07-17/all-row-utilization-v1/AB-KV3-F16-4K/sample-2/utilization-samples.csv</w:t>
+              <w:t>experiments/raw-results/retained/atomicbot-turboquant/2026-07-17/all-row-utilization-v1/AB-KV3-F16-4K/sample-2/utilization-samples.csv</w:t>
             </w:r>
           </w:p>
         </w:tc>
@@ -14581,7 +14581,7 @@
                 <w:rFonts w:ascii="Aptos" w:hAnsi="Aptos"/>
                 <w:sz w:val="16"/>
               </w:rPr>
-              <w:t>experiments/raw-results/atomicbot-turboquant/2026-07-17/all-row-utilization-v1/AB-03/sample-1/utilization-samples.csv</w:t>
+              <w:t>experiments/raw-results/retained/atomicbot-turboquant/2026-07-17/all-row-utilization-v1/AB-03/sample-1/utilization-samples.csv</w:t>
             </w:r>
           </w:p>
         </w:tc>
@@ -14658,7 +14658,7 @@
                 <w:rFonts w:ascii="Aptos" w:hAnsi="Aptos"/>
                 <w:sz w:val="16"/>
               </w:rPr>
-              <w:t>experiments/raw-results/atomicbot-turboquant/2026-07-17/all-row-utilization-v1/AB-09/sample-1/utilization-samples.csv</w:t>
+              <w:t>experiments/raw-results/retained/atomicbot-turboquant/2026-07-17/all-row-utilization-v1/AB-09/sample-1/utilization-samples.csv</w:t>
             </w:r>
           </w:p>
         </w:tc>
@@ -14739,7 +14739,7 @@
                 <w:rFonts w:ascii="Aptos" w:hAnsi="Aptos"/>
                 <w:sz w:val="16"/>
               </w:rPr>
-              <w:t>experiments/raw-results/atomicbot-turboquant/2026-07-17/all-row-utilization-v1/AB-11/sample-2/utilization-samples.csv</w:t>
+              <w:t>experiments/raw-results/retained/atomicbot-turboquant/2026-07-17/all-row-utilization-v1/AB-11/sample-2/utilization-samples.csv</w:t>
             </w:r>
           </w:p>
         </w:tc>
@@ -14816,7 +14816,7 @@
                 <w:rFonts w:ascii="Aptos" w:hAnsi="Aptos"/>
                 <w:sz w:val="16"/>
               </w:rPr>
-              <w:t>experiments/raw-results/atomicbot-turboquant/2026-07-17/all-row-utilization-v1/AB-15M/sample-1/utilization-samples.csv</w:t>
+              <w:t>experiments/raw-results/retained/atomicbot-turboquant/2026-07-17/all-row-utilization-v1/AB-15M/sample-1/utilization-samples.csv</w:t>
             </w:r>
           </w:p>
         </w:tc>
@@ -14897,7 +14897,7 @@
                 <w:rFonts w:ascii="Aptos" w:hAnsi="Aptos"/>
                 <w:sz w:val="16"/>
               </w:rPr>
-              <w:t>experiments/raw-results/atomicbot-turboquant/2026-07-17/all-row-utilization-v1/AB-04/sample-3/utilization-samples.csv</w:t>
+              <w:t>experiments/raw-results/retained/atomicbot-turboquant/2026-07-17/all-row-utilization-v1/AB-04/sample-3/utilization-samples.csv</w:t>
             </w:r>
           </w:p>
         </w:tc>
@@ -14974,7 +14974,7 @@
                 <w:rFonts w:ascii="Aptos" w:hAnsi="Aptos"/>
                 <w:sz w:val="16"/>
               </w:rPr>
-              <w:t>experiments/raw-results/atomicbot-turboquant/2026-07-17/all-row-utilization-v1/AB-11/sample-1/utilization-samples.csv</w:t>
+              <w:t>experiments/raw-results/retained/atomicbot-turboquant/2026-07-17/all-row-utilization-v1/AB-11/sample-1/utilization-samples.csv</w:t>
             </w:r>
           </w:p>
         </w:tc>
@@ -15055,7 +15055,7 @@
                 <w:rFonts w:ascii="Aptos" w:hAnsi="Aptos"/>
                 <w:sz w:val="16"/>
               </w:rPr>
-              <w:t>experiments/raw-results/atomicbot-turboquant/2026-07-17/all-row-utilization-v1/AB-09/sample-2/utilization-samples.csv</w:t>
+              <w:t>experiments/raw-results/retained/atomicbot-turboquant/2026-07-17/all-row-utilization-v1/AB-09/sample-2/utilization-samples.csv</w:t>
             </w:r>
           </w:p>
         </w:tc>
@@ -15132,7 +15132,7 @@
                 <w:rFonts w:ascii="Aptos" w:hAnsi="Aptos"/>
                 <w:sz w:val="16"/>
               </w:rPr>
-              <w:t>experiments/raw-results/atomicbot-turboquant/2026-07-17/all-row-utilization-v1/AB-05/sample-3/utilization-samples.csv</w:t>
+              <w:t>experiments/raw-results/retained/atomicbot-turboquant/2026-07-17/all-row-utilization-v1/AB-05/sample-3/utilization-samples.csv</w:t>
             </w:r>
           </w:p>
         </w:tc>
@@ -15213,7 +15213,7 @@
                 <w:rFonts w:ascii="Aptos" w:hAnsi="Aptos"/>
                 <w:sz w:val="16"/>
               </w:rPr>
-              <w:t>experiments/raw-results/atomicbot-turboquant/2026-07-17/all-row-utilization-v1/AB-06/sample-3/utilization-samples.csv</w:t>
+              <w:t>experiments/raw-results/retained/atomicbot-turboquant/2026-07-17/all-row-utilization-v1/AB-06/sample-3/utilization-samples.csv</w:t>
             </w:r>
           </w:p>
         </w:tc>
@@ -15290,7 +15290,7 @@
                 <w:rFonts w:ascii="Aptos" w:hAnsi="Aptos"/>
                 <w:sz w:val="16"/>
               </w:rPr>
-              <w:t>experiments/raw-results/atomicbot-turboquant/2026-07-17/all-row-utilization-v1/AB-08F/sample-3/utilization-samples.csv</w:t>
+              <w:t>experiments/raw-results/retained/atomicbot-turboquant/2026-07-17/all-row-utilization-v1/AB-08F/sample-3/utilization-samples.csv</w:t>
             </w:r>
           </w:p>
         </w:tc>
@@ -15371,7 +15371,7 @@
                 <w:rFonts w:ascii="Aptos" w:hAnsi="Aptos"/>
                 <w:sz w:val="16"/>
               </w:rPr>
-              <w:t>experiments/raw-results/atomicbot-turboquant/2026-07-17/all-row-utilization-v1/AB-05/sample-1/utilization-samples.csv</w:t>
+              <w:t>experiments/raw-results/retained/atomicbot-turboquant/2026-07-17/all-row-utilization-v1/AB-05/sample-1/utilization-samples.csv</w:t>
             </w:r>
           </w:p>
         </w:tc>
@@ -15448,7 +15448,7 @@
                 <w:rFonts w:ascii="Aptos" w:hAnsi="Aptos"/>
                 <w:sz w:val="16"/>
               </w:rPr>
-              <w:t>experiments/raw-results/atomicbot-turboquant/2026-07-17/all-row-utilization-v1/AB-08F/sample-2/utilization-samples.csv</w:t>
+              <w:t>experiments/raw-results/retained/atomicbot-turboquant/2026-07-17/all-row-utilization-v1/AB-08F/sample-2/utilization-samples.csv</w:t>
             </w:r>
           </w:p>
         </w:tc>
@@ -15529,7 +15529,7 @@
                 <w:rFonts w:ascii="Aptos" w:hAnsi="Aptos"/>
                 <w:sz w:val="16"/>
               </w:rPr>
-              <w:t>experiments/raw-results/atomicbot-turboquant/2026-07-17/all-row-utilization-v1/AB-10/sample-2/utilization-samples.csv</w:t>
+              <w:t>experiments/raw-results/retained/atomicbot-turboquant/2026-07-17/all-row-utilization-v1/AB-10/sample-2/utilization-samples.csv</w:t>
             </w:r>
           </w:p>
         </w:tc>
@@ -15606,7 +15606,7 @@
                 <w:rFonts w:ascii="Aptos" w:hAnsi="Aptos"/>
                 <w:sz w:val="16"/>
               </w:rPr>
-              <w:t>experiments/raw-results/atomicbot-turboquant/2026-07-17/all-row-utilization-v1/AB-03/sample-2/utilization-samples.csv</w:t>
+              <w:t>experiments/raw-results/retained/atomicbot-turboquant/2026-07-17/all-row-utilization-v1/AB-03/sample-2/utilization-samples.csv</w:t>
             </w:r>
           </w:p>
         </w:tc>
@@ -15687,7 +15687,7 @@
                 <w:rFonts w:ascii="Aptos" w:hAnsi="Aptos"/>
                 <w:sz w:val="16"/>
               </w:rPr>
-              <w:t>experiments/raw-results/atomicbot-turboquant/2026-07-17/all-row-utilization-v1/AB-09/sample-3/utilization-samples.csv</w:t>
+              <w:t>experiments/raw-results/retained/atomicbot-turboquant/2026-07-17/all-row-utilization-v1/AB-09/sample-3/utilization-samples.csv</w:t>
             </w:r>
           </w:p>
         </w:tc>
@@ -15764,7 +15764,7 @@
                 <w:rFonts w:ascii="Aptos" w:hAnsi="Aptos"/>
                 <w:sz w:val="16"/>
               </w:rPr>
-              <w:t>experiments/raw-results/atomicbot-turboquant/2026-07-17/all-row-utilization-v1/AB-KV8-F16-4K/sample-1/utilization-samples.csv</w:t>
+              <w:t>experiments/raw-results/retained/atomicbot-turboquant/2026-07-17/all-row-utilization-v1/AB-KV8-F16-4K/sample-1/utilization-samples.csv</w:t>
             </w:r>
           </w:p>
         </w:tc>
@@ -15845,7 +15845,7 @@
                 <w:rFonts w:ascii="Aptos" w:hAnsi="Aptos"/>
                 <w:sz w:val="16"/>
               </w:rPr>
-              <w:t>experiments/raw-results/atomicbot-turboquant/2026-07-17/all-row-utilization-v1/AB-01/sample-2/utilization-samples.csv</w:t>
+              <w:t>experiments/raw-results/retained/atomicbot-turboquant/2026-07-17/all-row-utilization-v1/AB-01/sample-2/utilization-samples.csv</w:t>
             </w:r>
           </w:p>
         </w:tc>
@@ -15922,7 +15922,7 @@
                 <w:rFonts w:ascii="Aptos" w:hAnsi="Aptos"/>
                 <w:sz w:val="16"/>
               </w:rPr>
-              <w:t>experiments/raw-results/atomicbot-turboquant/2026-07-17/all-row-utilization-v1/AB-02/sample-3/utilization-samples.csv</w:t>
+              <w:t>experiments/raw-results/retained/atomicbot-turboquant/2026-07-17/all-row-utilization-v1/AB-02/sample-3/utilization-samples.csv</w:t>
             </w:r>
           </w:p>
         </w:tc>
@@ -16003,7 +16003,7 @@
                 <w:rFonts w:ascii="Aptos" w:hAnsi="Aptos"/>
                 <w:sz w:val="16"/>
               </w:rPr>
-              <w:t>experiments/raw-results/atomicbot-turboquant/2026-07-17/all-row-utilization-v1/AB-08Q/sample-1/utilization-samples.csv</w:t>
+              <w:t>experiments/raw-results/retained/atomicbot-turboquant/2026-07-17/all-row-utilization-v1/AB-08Q/sample-1/utilization-samples.csv</w:t>
             </w:r>
           </w:p>
         </w:tc>
@@ -16080,7 +16080,7 @@
                 <w:rFonts w:ascii="Aptos" w:hAnsi="Aptos"/>
                 <w:sz w:val="16"/>
               </w:rPr>
-              <w:t>experiments/raw-results/atomicbot-turboquant/2026-07-17/all-row-utilization-v1/AB-10/sample-3/utilization-samples.csv</w:t>
+              <w:t>experiments/raw-results/retained/atomicbot-turboquant/2026-07-17/all-row-utilization-v1/AB-10/sample-3/utilization-samples.csv</w:t>
             </w:r>
           </w:p>
         </w:tc>
@@ -16161,7 +16161,7 @@
                 <w:rFonts w:ascii="Aptos" w:hAnsi="Aptos"/>
                 <w:sz w:val="16"/>
               </w:rPr>
-              <w:t>experiments/raw-results/atomicbot-turboquant/2026-07-17/all-row-utilization-v1/AB-13/sample-3/utilization-samples.csv</w:t>
+              <w:t>experiments/raw-results/retained/atomicbot-turboquant/2026-07-17/all-row-utilization-v1/AB-13/sample-3/utilization-samples.csv</w:t>
             </w:r>
           </w:p>
         </w:tc>
@@ -16238,7 +16238,7 @@
                 <w:rFonts w:ascii="Aptos" w:hAnsi="Aptos"/>
                 <w:sz w:val="16"/>
               </w:rPr>
-              <w:t>experiments/raw-results/atomicbot-turboquant/2026-07-17/all-row-utilization-v1/AB-15/sample-1/utilization-samples.csv</w:t>
+              <w:t>experiments/raw-results/retained/atomicbot-turboquant/2026-07-17/all-row-utilization-v1/AB-15/sample-1/utilization-samples.csv</w:t>
             </w:r>
           </w:p>
         </w:tc>
@@ -16319,7 +16319,7 @@
                 <w:rFonts w:ascii="Aptos" w:hAnsi="Aptos"/>
                 <w:sz w:val="16"/>
               </w:rPr>
-              <w:t>experiments/raw-results/atomicbot-turboquant/2026-07-17/all-row-utilization-v1/AB-14/sample-2/utilization-samples.csv</w:t>
+              <w:t>experiments/raw-results/retained/atomicbot-turboquant/2026-07-17/all-row-utilization-v1/AB-14/sample-2/utilization-samples.csv</w:t>
             </w:r>
           </w:p>
         </w:tc>
@@ -16396,7 +16396,7 @@
                 <w:rFonts w:ascii="Aptos" w:hAnsi="Aptos"/>
                 <w:sz w:val="16"/>
               </w:rPr>
-              <w:t>experiments/raw-results/atomicbot-turboquant/2026-07-17/all-row-utilization-v1/AB-10/sample-1/utilization-samples.csv</w:t>
+              <w:t>experiments/raw-results/retained/atomicbot-turboquant/2026-07-17/all-row-utilization-v1/AB-10/sample-1/utilization-samples.csv</w:t>
             </w:r>
           </w:p>
         </w:tc>
@@ -16477,7 +16477,7 @@
                 <w:rFonts w:ascii="Aptos" w:hAnsi="Aptos"/>
                 <w:sz w:val="16"/>
               </w:rPr>
-              <w:t>experiments/raw-results/atomicbot-turboquant/2026-07-17/all-row-utilization-v1/AB-08Q/sample-3/utilization-samples.csv</w:t>
+              <w:t>experiments/raw-results/retained/atomicbot-turboquant/2026-07-17/all-row-utilization-v1/AB-08Q/sample-3/utilization-samples.csv</w:t>
             </w:r>
           </w:p>
         </w:tc>
@@ -16554,7 +16554,7 @@
                 <w:rFonts w:ascii="Aptos" w:hAnsi="Aptos"/>
                 <w:sz w:val="16"/>
               </w:rPr>
-              <w:t>experiments/raw-results/atomicbot-turboquant/2026-07-17/all-row-utilization-v1/AB-15M/sample-3/utilization-samples.csv</w:t>
+              <w:t>experiments/raw-results/retained/atomicbot-turboquant/2026-07-17/all-row-utilization-v1/AB-15M/sample-3/utilization-samples.csv</w:t>
             </w:r>
           </w:p>
         </w:tc>
@@ -16635,7 +16635,7 @@
                 <w:rFonts w:ascii="Aptos" w:hAnsi="Aptos"/>
                 <w:sz w:val="16"/>
               </w:rPr>
-              <w:t>experiments/raw-results/atomicbot-turboquant/2026-07-17/all-row-utilization-v1/AB-08F/sample-1/utilization-samples.csv</w:t>
+              <w:t>experiments/raw-results/retained/atomicbot-turboquant/2026-07-17/all-row-utilization-v1/AB-08F/sample-1/utilization-samples.csv</w:t>
             </w:r>
           </w:p>
         </w:tc>
@@ -16712,7 +16712,7 @@
                 <w:rFonts w:ascii="Aptos" w:hAnsi="Aptos"/>
                 <w:sz w:val="16"/>
               </w:rPr>
-              <w:t>experiments/raw-results/atomicbot-turboquant/2026-07-17/all-row-utilization-v1/AB-KV3-F16-4K/sample-3/utilization-samples.csv</w:t>
+              <w:t>experiments/raw-results/retained/atomicbot-turboquant/2026-07-17/all-row-utilization-v1/AB-KV3-F16-4K/sample-3/utilization-samples.csv</w:t>
             </w:r>
           </w:p>
         </w:tc>
@@ -16793,7 +16793,7 @@
                 <w:rFonts w:ascii="Aptos" w:hAnsi="Aptos"/>
                 <w:sz w:val="16"/>
               </w:rPr>
-              <w:t>experiments/raw-results/atomicbot-turboquant/2026-07-17/all-row-utilization-v1/AB-11/sample-3/utilization-samples.csv</w:t>
+              <w:t>experiments/raw-results/retained/atomicbot-turboquant/2026-07-17/all-row-utilization-v1/AB-11/sample-3/utilization-samples.csv</w:t>
             </w:r>
           </w:p>
         </w:tc>
@@ -16870,7 +16870,7 @@
                 <w:rFonts w:ascii="Aptos" w:hAnsi="Aptos"/>
                 <w:sz w:val="16"/>
               </w:rPr>
-              <w:t>experiments/raw-results/atomicbot-turboquant/2026-07-17/all-row-utilization-v1/AB-13/sample-1/utilization-samples.csv</w:t>
+              <w:t>experiments/raw-results/retained/atomicbot-turboquant/2026-07-17/all-row-utilization-v1/AB-13/sample-1/utilization-samples.csv</w:t>
             </w:r>
           </w:p>
         </w:tc>
@@ -16951,7 +16951,7 @@
                 <w:rFonts w:ascii="Aptos" w:hAnsi="Aptos"/>
                 <w:sz w:val="16"/>
               </w:rPr>
-              <w:t>experiments/raw-results/atomicbot-turboquant/2026-07-17/all-row-utilization-v1/AB-15/sample-2/utilization-samples.csv</w:t>
+              <w:t>experiments/raw-results/retained/atomicbot-turboquant/2026-07-17/all-row-utilization-v1/AB-15/sample-2/utilization-samples.csv</w:t>
             </w:r>
           </w:p>
         </w:tc>
@@ -17028,7 +17028,7 @@
                 <w:rFonts w:ascii="Aptos" w:hAnsi="Aptos"/>
                 <w:sz w:val="16"/>
               </w:rPr>
-              <w:t>experiments/raw-results/atomicbot-turboquant/2026-07-17/all-row-utilization-v1/AB-14/sample-3/utilization-samples.csv</w:t>
+              <w:t>experiments/raw-results/retained/atomicbot-turboquant/2026-07-17/all-row-utilization-v1/AB-14/sample-3/utilization-samples.csv</w:t>
             </w:r>
           </w:p>
         </w:tc>
@@ -17109,7 +17109,7 @@
                 <w:rFonts w:ascii="Aptos" w:hAnsi="Aptos"/>
                 <w:sz w:val="16"/>
               </w:rPr>
-              <w:t>experiments/raw-results/atomicbot-turboquant/2026-07-17/all-row-utilization-v1/AB-13/sample-2/utilization-samples.csv</w:t>
+              <w:t>experiments/raw-results/retained/atomicbot-turboquant/2026-07-17/all-row-utilization-v1/AB-13/sample-2/utilization-samples.csv</w:t>
             </w:r>
           </w:p>
         </w:tc>
@@ -17186,7 +17186,7 @@
                 <w:rFonts w:ascii="Aptos" w:hAnsi="Aptos"/>
                 <w:sz w:val="16"/>
               </w:rPr>
-              <w:t>experiments/raw-results/atomicbot-turboquant/2026-07-17/all-row-utilization-v1/AB-07/sample-2/utilization-samples.csv</w:t>
+              <w:t>experiments/raw-results/retained/atomicbot-turboquant/2026-07-17/all-row-utilization-v1/AB-07/sample-2/utilization-samples.csv</w:t>
             </w:r>
           </w:p>
         </w:tc>
@@ -17267,7 +17267,7 @@
                 <w:rFonts w:ascii="Aptos" w:hAnsi="Aptos"/>
                 <w:sz w:val="16"/>
               </w:rPr>
-              <w:t>experiments/raw-results/atomicbot-turboquant/2026-07-17/all-row-utilization-v1/AB-02/sample-2/utilization-samples.csv</w:t>
+              <w:t>experiments/raw-results/retained/atomicbot-turboquant/2026-07-17/all-row-utilization-v1/AB-02/sample-2/utilization-samples.csv</w:t>
             </w:r>
           </w:p>
         </w:tc>
@@ -17344,7 +17344,7 @@
                 <w:rFonts w:ascii="Aptos" w:hAnsi="Aptos"/>
                 <w:sz w:val="16"/>
               </w:rPr>
-              <w:t>experiments/raw-results/atomicbot-turboquant/2026-07-17/all-row-utilization-v1/AB-03/sample-3/utilization-samples.csv</w:t>
+              <w:t>experiments/raw-results/retained/atomicbot-turboquant/2026-07-17/all-row-utilization-v1/AB-03/sample-3/utilization-samples.csv</w:t>
             </w:r>
           </w:p>
         </w:tc>
@@ -17425,7 +17425,7 @@
                 <w:rFonts w:ascii="Aptos" w:hAnsi="Aptos"/>
                 <w:sz w:val="16"/>
               </w:rPr>
-              <w:t>experiments/raw-results/atomicbot-turboquant/2026-07-17/all-row-utilization-v1/AB-05/sample-2/utilization-samples.csv</w:t>
+              <w:t>experiments/raw-results/retained/atomicbot-turboquant/2026-07-17/all-row-utilization-v1/AB-05/sample-2/utilization-samples.csv</w:t>
             </w:r>
           </w:p>
         </w:tc>
@@ -17502,7 +17502,7 @@
                 <w:rFonts w:ascii="Aptos" w:hAnsi="Aptos"/>
                 <w:sz w:val="16"/>
               </w:rPr>
-              <w:t>experiments/raw-results/atomicbot-turboquant/2026-07-17/all-row-utilization-v1/AB-07/sample-3/utilization-samples.csv</w:t>
+              <w:t>experiments/raw-results/retained/atomicbot-turboquant/2026-07-17/all-row-utilization-v1/AB-07/sample-3/utilization-samples.csv</w:t>
             </w:r>
           </w:p>
         </w:tc>
@@ -17583,7 +17583,7 @@
                 <w:rFonts w:ascii="Aptos" w:hAnsi="Aptos"/>
                 <w:sz w:val="16"/>
               </w:rPr>
-              <w:t>experiments/raw-results/atomicbot-turboquant/2026-07-17/all-row-utilization-v1/AB-02/sample-1/utilization-samples.csv</w:t>
+              <w:t>experiments/raw-results/retained/atomicbot-turboquant/2026-07-17/all-row-utilization-v1/AB-02/sample-1/utilization-samples.csv</w:t>
             </w:r>
           </w:p>
         </w:tc>
@@ -17660,7 +17660,7 @@
                 <w:rFonts w:ascii="Aptos" w:hAnsi="Aptos"/>
                 <w:sz w:val="16"/>
               </w:rPr>
-              <w:t>experiments/raw-results/atomicbot-turboquant/2026-07-17/all-row-utilization-v1/AB-01/sample-3/utilization-samples.csv</w:t>
+              <w:t>experiments/raw-results/retained/atomicbot-turboquant/2026-07-17/all-row-utilization-v1/AB-01/sample-3/utilization-samples.csv</w:t>
             </w:r>
           </w:p>
         </w:tc>
@@ -17741,7 +17741,7 @@
                 <w:rFonts w:ascii="Aptos" w:hAnsi="Aptos"/>
                 <w:sz w:val="16"/>
               </w:rPr>
-              <w:t>experiments/raw-results/atomicbot-turboquant/2026-07-17/all-row-utilization-v1/AB-12/sample-1/utilization-samples.csv</w:t>
+              <w:t>experiments/raw-results/retained/atomicbot-turboquant/2026-07-17/all-row-utilization-v1/AB-12/sample-1/utilization-samples.csv</w:t>
             </w:r>
           </w:p>
         </w:tc>
@@ -17818,7 +17818,7 @@
                 <w:rFonts w:ascii="Aptos" w:hAnsi="Aptos"/>
                 <w:sz w:val="16"/>
               </w:rPr>
-              <w:t>experiments/raw-results/atomicbot-turboquant/2026-07-17/all-row-utilization-v1/AB-04/sample-2/utilization-samples.csv</w:t>
+              <w:t>experiments/raw-results/retained/atomicbot-turboquant/2026-07-17/all-row-utilization-v1/AB-04/sample-2/utilization-samples.csv</w:t>
             </w:r>
           </w:p>
         </w:tc>
@@ -17899,7 +17899,7 @@
                 <w:rFonts w:ascii="Aptos" w:hAnsi="Aptos"/>
                 <w:sz w:val="16"/>
               </w:rPr>
-              <w:t>experiments/raw-results/atomicbot-turboquant/2026-07-17/all-row-utilization-v1/AB-14/sample-1/utilization-samples.csv</w:t>
+              <w:t>experiments/raw-results/retained/atomicbot-turboquant/2026-07-17/all-row-utilization-v1/AB-14/sample-1/utilization-samples.csv</w:t>
             </w:r>
           </w:p>
         </w:tc>
@@ -17976,7 +17976,7 @@
                 <w:rFonts w:ascii="Aptos" w:hAnsi="Aptos"/>
                 <w:sz w:val="16"/>
               </w:rPr>
-              <w:t>experiments/raw-results/atomicbot-turboquant/2026-07-17/all-row-utilization-v1/AB-12/sample-3/utilization-samples.csv</w:t>
+              <w:t>experiments/raw-results/retained/atomicbot-turboquant/2026-07-17/all-row-utilization-v1/AB-12/sample-3/utilization-samples.csv</w:t>
             </w:r>
           </w:p>
         </w:tc>
@@ -18057,7 +18057,7 @@
                 <w:rFonts w:ascii="Aptos" w:hAnsi="Aptos"/>
                 <w:sz w:val="16"/>
               </w:rPr>
-              <w:t>experiments/raw-results/atomicbot-turboquant/2026-07-17/all-row-utilization-v1/AB-KV3-F16-4K/sample-1/utilization-samples.csv</w:t>
+              <w:t>experiments/raw-results/retained/atomicbot-turboquant/2026-07-17/all-row-utilization-v1/AB-KV3-F16-4K/sample-1/utilization-samples.csv</w:t>
             </w:r>
           </w:p>
         </w:tc>
@@ -18134,7 +18134,7 @@
                 <w:rFonts w:ascii="Aptos" w:hAnsi="Aptos"/>
                 <w:sz w:val="16"/>
               </w:rPr>
-              <w:t>experiments/raw-results/atomicbot-turboquant/2026-07-17/all-row-utilization-v1/AB-12/sample-2/utilization-samples.csv</w:t>
+              <w:t>experiments/raw-results/retained/atomicbot-turboquant/2026-07-17/all-row-utilization-v1/AB-12/sample-2/utilization-samples.csv</w:t>
             </w:r>
           </w:p>
         </w:tc>
@@ -18215,7 +18215,7 @@
                 <w:rFonts w:ascii="Aptos" w:hAnsi="Aptos"/>
                 <w:sz w:val="16"/>
               </w:rPr>
-              <w:t>experiments/raw-results/atomicbot-turboquant/2026-07-17/all-row-utilization-v1/AB-06/sample-2/utilization-samples.csv</w:t>
+              <w:t>experiments/raw-results/retained/atomicbot-turboquant/2026-07-17/all-row-utilization-v1/AB-06/sample-2/utilization-samples.csv</w:t>
             </w:r>
           </w:p>
         </w:tc>
@@ -18292,7 +18292,7 @@
                 <w:rFonts w:ascii="Aptos" w:hAnsi="Aptos"/>
                 <w:sz w:val="16"/>
               </w:rPr>
-              <w:t>experiments/raw-results/atomicbot-turboquant/2026-07-17/all-row-utilization-v1/AB-KV8-F16-4K/sample-3/utilization-samples.csv</w:t>
+              <w:t>experiments/raw-results/retained/atomicbot-turboquant/2026-07-17/all-row-utilization-v1/AB-KV8-F16-4K/sample-3/utilization-samples.csv</w:t>
             </w:r>
           </w:p>
         </w:tc>
@@ -18450,7 +18450,7 @@
                 <w:rFonts w:ascii="Aptos" w:hAnsi="Aptos"/>
                 <w:sz w:val="16"/>
               </w:rPr>
-              <w:t>experiments/raw-results/atomicbot-turboquant/2026-07-17/all-row-utilization-v1/AB-13/server-metrics-summary.json</w:t>
+              <w:t>experiments/raw-results/retained/atomicbot-turboquant/2026-07-17/all-row-utilization-v1/AB-13/server-metrics-summary.json</w:t>
             </w:r>
           </w:p>
         </w:tc>
@@ -18531,7 +18531,7 @@
                 <w:rFonts w:ascii="Aptos" w:hAnsi="Aptos"/>
                 <w:sz w:val="16"/>
               </w:rPr>
-              <w:t>experiments/raw-results/atomicbot-turboquant/2026-07-17/all-row-utilization-v1/AB-06/server-metrics-summary.json</w:t>
+              <w:t>experiments/raw-results/retained/atomicbot-turboquant/2026-07-17/all-row-utilization-v1/AB-06/server-metrics-summary.json</w:t>
             </w:r>
           </w:p>
         </w:tc>
@@ -18608,7 +18608,7 @@
                 <w:rFonts w:ascii="Aptos" w:hAnsi="Aptos"/>
                 <w:sz w:val="16"/>
               </w:rPr>
-              <w:t>experiments/raw-results/atomicbot-turboquant/2026-07-17/all-row-utilization-v1/AB-15M/server-metrics-summary.json</w:t>
+              <w:t>experiments/raw-results/retained/atomicbot-turboquant/2026-07-17/all-row-utilization-v1/AB-15M/server-metrics-summary.json</w:t>
             </w:r>
           </w:p>
         </w:tc>
@@ -18689,7 +18689,7 @@
                 <w:rFonts w:ascii="Aptos" w:hAnsi="Aptos"/>
                 <w:sz w:val="16"/>
               </w:rPr>
-              <w:t>experiments/raw-results/atomicbot-turboquant/2026-07-17/all-row-utilization-v1/AB-10/server-metrics-summary.json</w:t>
+              <w:t>experiments/raw-results/retained/atomicbot-turboquant/2026-07-17/all-row-utilization-v1/AB-10/server-metrics-summary.json</w:t>
             </w:r>
           </w:p>
         </w:tc>
@@ -18766,7 +18766,7 @@
                 <w:rFonts w:ascii="Aptos" w:hAnsi="Aptos"/>
                 <w:sz w:val="16"/>
               </w:rPr>
-              <w:t>experiments/raw-results/atomicbot-turboquant/2026-07-17/all-row-utilization-v1/AB-KV3-F16-4K/server-metrics-summary.json</w:t>
+              <w:t>experiments/raw-results/retained/atomicbot-turboquant/2026-07-17/all-row-utilization-v1/AB-KV3-F16-4K/server-metrics-summary.json</w:t>
             </w:r>
           </w:p>
         </w:tc>
@@ -18847,7 +18847,7 @@
                 <w:rFonts w:ascii="Aptos" w:hAnsi="Aptos"/>
                 <w:sz w:val="16"/>
               </w:rPr>
-              <w:t>experiments/raw-results/atomicbot-turboquant/2026-07-17/all-row-utilization-v1/AB-09/server-metrics-summary.json</w:t>
+              <w:t>experiments/raw-results/retained/atomicbot-turboquant/2026-07-17/all-row-utilization-v1/AB-09/server-metrics-summary.json</w:t>
             </w:r>
           </w:p>
         </w:tc>
@@ -18924,7 +18924,7 @@
                 <w:rFonts w:ascii="Aptos" w:hAnsi="Aptos"/>
                 <w:sz w:val="16"/>
               </w:rPr>
-              <w:t>experiments/raw-results/atomicbot-turboquant/2026-07-17/all-row-utilization-v1/AB-14/server-metrics-summary.json</w:t>
+              <w:t>experiments/raw-results/retained/atomicbot-turboquant/2026-07-17/all-row-utilization-v1/AB-14/server-metrics-summary.json</w:t>
             </w:r>
           </w:p>
         </w:tc>
@@ -19005,7 +19005,7 @@
                 <w:rFonts w:ascii="Aptos" w:hAnsi="Aptos"/>
                 <w:sz w:val="16"/>
               </w:rPr>
-              <w:t>experiments/raw-results/atomicbot-turboquant/2026-07-17/all-row-utilization-v1/AB-KV8-F16-4K/server-metrics-summary.json</w:t>
+              <w:t>experiments/raw-results/retained/atomicbot-turboquant/2026-07-17/all-row-utilization-v1/AB-KV8-F16-4K/server-metrics-summary.json</w:t>
             </w:r>
           </w:p>
         </w:tc>
@@ -19082,7 +19082,7 @@
                 <w:rFonts w:ascii="Aptos" w:hAnsi="Aptos"/>
                 <w:sz w:val="16"/>
               </w:rPr>
-              <w:t>experiments/raw-results/atomicbot-turboquant/2026-07-17/all-row-utilization-v1/AB-08Q/server-metrics-summary.json</w:t>
+              <w:t>experiments/raw-results/retained/atomicbot-turboquant/2026-07-17/all-row-utilization-v1/AB-08Q/server-metrics-summary.json</w:t>
             </w:r>
           </w:p>
         </w:tc>
@@ -19163,7 +19163,7 @@
                 <w:rFonts w:ascii="Aptos" w:hAnsi="Aptos"/>
                 <w:sz w:val="16"/>
               </w:rPr>
-              <w:t>experiments/raw-results/atomicbot-turboquant/2026-07-17/all-row-utilization-v1/AB-12/server-metrics-summary.json</w:t>
+              <w:t>experiments/raw-results/retained/atomicbot-turboquant/2026-07-17/all-row-utilization-v1/AB-12/server-metrics-summary.json</w:t>
             </w:r>
           </w:p>
         </w:tc>
@@ -19240,7 +19240,7 @@
                 <w:rFonts w:ascii="Aptos" w:hAnsi="Aptos"/>
                 <w:sz w:val="16"/>
               </w:rPr>
-              <w:t>experiments/raw-results/atomicbot-turboquant/2026-07-17/all-row-utilization-v1/AB-02/server-metrics-summary.json</w:t>
+              <w:t>experiments/raw-results/retained/atomicbot-turboquant/2026-07-17/all-row-utilization-v1/AB-02/server-metrics-summary.json</w:t>
             </w:r>
           </w:p>
         </w:tc>
@@ -19321,7 +19321,7 @@
                 <w:rFonts w:ascii="Aptos" w:hAnsi="Aptos"/>
                 <w:sz w:val="16"/>
               </w:rPr>
-              <w:t>experiments/raw-results/atomicbot-turboquant/2026-07-17/all-row-utilization-v1/AB-04/server-metrics-summary.json</w:t>
+              <w:t>experiments/raw-results/retained/atomicbot-turboquant/2026-07-17/all-row-utilization-v1/AB-04/server-metrics-summary.json</w:t>
             </w:r>
           </w:p>
         </w:tc>
@@ -19398,7 +19398,7 @@
                 <w:rFonts w:ascii="Aptos" w:hAnsi="Aptos"/>
                 <w:sz w:val="16"/>
               </w:rPr>
-              <w:t>experiments/raw-results/atomicbot-turboquant/2026-07-17/all-row-utilization-v1/AB-05/server-metrics-summary.json</w:t>
+              <w:t>experiments/raw-results/retained/atomicbot-turboquant/2026-07-17/all-row-utilization-v1/AB-05/server-metrics-summary.json</w:t>
             </w:r>
           </w:p>
         </w:tc>
@@ -19479,7 +19479,7 @@
                 <w:rFonts w:ascii="Aptos" w:hAnsi="Aptos"/>
                 <w:sz w:val="16"/>
               </w:rPr>
-              <w:t>experiments/raw-results/atomicbot-turboquant/2026-07-17/all-row-utilization-v1/AB-03/server-metrics-summary.json</w:t>
+              <w:t>experiments/raw-results/retained/atomicbot-turboquant/2026-07-17/all-row-utilization-v1/AB-03/server-metrics-summary.json</w:t>
             </w:r>
           </w:p>
         </w:tc>
@@ -19556,7 +19556,7 @@
                 <w:rFonts w:ascii="Aptos" w:hAnsi="Aptos"/>
                 <w:sz w:val="16"/>
               </w:rPr>
-              <w:t>experiments/raw-results/atomicbot-turboquant/2026-07-17/all-row-utilization-v1/AB-15/server-metrics-summary.json</w:t>
+              <w:t>experiments/raw-results/retained/atomicbot-turboquant/2026-07-17/all-row-utilization-v1/AB-15/server-metrics-summary.json</w:t>
             </w:r>
           </w:p>
         </w:tc>
@@ -19637,7 +19637,7 @@
                 <w:rFonts w:ascii="Aptos" w:hAnsi="Aptos"/>
                 <w:sz w:val="16"/>
               </w:rPr>
-              <w:t>experiments/raw-results/atomicbot-turboquant/2026-07-17/all-row-utilization-v1/AB-07/server-metrics-summary.json</w:t>
+              <w:t>experiments/raw-results/retained/atomicbot-turboquant/2026-07-17/all-row-utilization-v1/AB-07/server-metrics-summary.json</w:t>
             </w:r>
           </w:p>
         </w:tc>
@@ -19714,7 +19714,7 @@
                 <w:rFonts w:ascii="Aptos" w:hAnsi="Aptos"/>
                 <w:sz w:val="16"/>
               </w:rPr>
-              <w:t>experiments/raw-results/atomicbot-turboquant/2026-07-17/all-row-utilization-v1/AB-08F/server-metrics-summary.json</w:t>
+              <w:t>experiments/raw-results/retained/atomicbot-turboquant/2026-07-17/all-row-utilization-v1/AB-08F/server-metrics-summary.json</w:t>
             </w:r>
           </w:p>
         </w:tc>
@@ -19795,7 +19795,7 @@
                 <w:rFonts w:ascii="Aptos" w:hAnsi="Aptos"/>
                 <w:sz w:val="16"/>
               </w:rPr>
-              <w:t>experiments/raw-results/atomicbot-turboquant/2026-07-17/all-row-utilization-v1/AB-01/server-metrics-summary.json</w:t>
+              <w:t>experiments/raw-results/retained/atomicbot-turboquant/2026-07-17/all-row-utilization-v1/AB-01/server-metrics-summary.json</w:t>
             </w:r>
           </w:p>
         </w:tc>
@@ -19872,7 +19872,7 @@
                 <w:rFonts w:ascii="Aptos" w:hAnsi="Aptos"/>
                 <w:sz w:val="16"/>
               </w:rPr>
-              <w:t>experiments/raw-results/atomicbot-turboquant/2026-07-17/all-row-utilization-v1/AB-11/server-metrics-summary.json</w:t>
+              <w:t>experiments/raw-results/retained/atomicbot-turboquant/2026-07-17/all-row-utilization-v1/AB-11/server-metrics-summary.json</w:t>
             </w:r>
           </w:p>
         </w:tc>
@@ -19953,7 +19953,7 @@
                 <w:rFonts w:ascii="Aptos" w:hAnsi="Aptos"/>
                 <w:sz w:val="16"/>
               </w:rPr>
-              <w:t>experiments/raw-results/atomicbot-turboquant/2026-07-16/acquisition/results/AtomicBot_Environment_Manifest.json</w:t>
+              <w:t>experiments/raw-results/retained/atomicbot-turboquant/2026-07-16/acquisition/results/AtomicBot_Environment_Manifest.json</w:t>
             </w:r>
           </w:p>
         </w:tc>
@@ -20111,7 +20111,7 @@
                 <w:rFonts w:ascii="Aptos" w:hAnsi="Aptos"/>
                 <w:sz w:val="16"/>
               </w:rPr>
-              <w:t>experiments/raw-results/atomicbot-turboquant/2026-07-16/acquisition/results/AtomicBot_Failure_Log.json</w:t>
+              <w:t>experiments/raw-results/retained/atomicbot-turboquant/2026-07-16/acquisition/results/AtomicBot_Failure_Log.json</w:t>
             </w:r>
           </w:p>
         </w:tc>
@@ -20269,7 +20269,7 @@
                 <w:rFonts w:ascii="Aptos" w:hAnsi="Aptos"/>
                 <w:sz w:val="16"/>
               </w:rPr>
-              <w:t>experiments/raw-results/atomicbot-turboquant/2026-07-16/acquisition/metrics/AB-14/AB-14-formal-summary.json</w:t>
+              <w:t>experiments/raw-results/retained/atomicbot-turboquant/2026-07-16/acquisition/metrics/AB-14/AB-14-formal-summary.json</w:t>
             </w:r>
           </w:p>
         </w:tc>
@@ -20346,7 +20346,7 @@
                 <w:rFonts w:ascii="Aptos" w:hAnsi="Aptos"/>
                 <w:sz w:val="16"/>
               </w:rPr>
-              <w:t>experiments/raw-results/atomicbot-turboquant/2026-07-16/acquisition/metrics/AB-15/AB-15-formal-summary.json</w:t>
+              <w:t>experiments/raw-results/retained/atomicbot-turboquant/2026-07-16/acquisition/metrics/AB-15/AB-15-formal-summary.json</w:t>
             </w:r>
           </w:p>
         </w:tc>
@@ -20427,7 +20427,7 @@
                 <w:rFonts w:ascii="Aptos" w:hAnsi="Aptos"/>
                 <w:sz w:val="16"/>
               </w:rPr>
-              <w:t>experiments/raw-results/atomicbot-turboquant/2026-07-16/acquisition/metrics/AB-09/AB-09-formal-summary.json</w:t>
+              <w:t>experiments/raw-results/retained/atomicbot-turboquant/2026-07-16/acquisition/metrics/AB-09/AB-09-formal-summary.json</w:t>
             </w:r>
           </w:p>
         </w:tc>
@@ -20504,7 +20504,7 @@
                 <w:rFonts w:ascii="Aptos" w:hAnsi="Aptos"/>
                 <w:sz w:val="16"/>
               </w:rPr>
-              <w:t>experiments/raw-results/atomicbot-turboquant/2026-07-16/acquisition/metrics/AB-10/AB-10-formal-summary.json</w:t>
+              <w:t>experiments/raw-results/retained/atomicbot-turboquant/2026-07-16/acquisition/metrics/AB-10/AB-10-formal-summary.json</w:t>
             </w:r>
           </w:p>
         </w:tc>
@@ -20585,7 +20585,7 @@
                 <w:rFonts w:ascii="Aptos" w:hAnsi="Aptos"/>
                 <w:sz w:val="16"/>
               </w:rPr>
-              <w:t>experiments/raw-results/atomicbot-turboquant/2026-07-16/acquisition/metrics/AB-04/AB-04-formal-summary.json</w:t>
+              <w:t>experiments/raw-results/retained/atomicbot-turboquant/2026-07-16/acquisition/metrics/AB-04/AB-04-formal-summary.json</w:t>
             </w:r>
           </w:p>
         </w:tc>
@@ -20662,7 +20662,7 @@
                 <w:rFonts w:ascii="Aptos" w:hAnsi="Aptos"/>
                 <w:sz w:val="16"/>
               </w:rPr>
-              <w:t>experiments/raw-results/atomicbot-turboquant/2026-07-16/safety-bypass/AB-KV8-F16-4K/cli-throughput/sample-2/events.jsonl</w:t>
+              <w:t>experiments/raw-results/retained/atomicbot-turboquant/2026-07-16/safety-bypass/AB-KV8-F16-4K/cli-throughput/sample-2/events.jsonl</w:t>
             </w:r>
           </w:p>
         </w:tc>
@@ -20743,7 +20743,7 @@
                 <w:rFonts w:ascii="Aptos" w:hAnsi="Aptos"/>
                 <w:sz w:val="16"/>
               </w:rPr>
-              <w:t>experiments/raw-results/atomicbot-turboquant/2026-07-16/acquisition/metrics/AB-KV3-F16-4K/AB-KV3-F16-4K-formal-summary.json</w:t>
+              <w:t>experiments/raw-results/retained/atomicbot-turboquant/2026-07-16/acquisition/metrics/AB-KV3-F16-4K/AB-KV3-F16-4K-formal-summary.json</w:t>
             </w:r>
           </w:p>
         </w:tc>
@@ -20820,7 +20820,7 @@
                 <w:rFonts w:ascii="Aptos" w:hAnsi="Aptos"/>
                 <w:sz w:val="16"/>
               </w:rPr>
-              <w:t>experiments/raw-results/atomicbot-turboquant/2026-07-16/acquisition/metrics/AB-12/AB-12-formal-summary.json</w:t>
+              <w:t>experiments/raw-results/retained/atomicbot-turboquant/2026-07-16/acquisition/metrics/AB-12/AB-12-formal-summary.json</w:t>
             </w:r>
           </w:p>
         </w:tc>
@@ -20901,7 +20901,7 @@
                 <w:rFonts w:ascii="Aptos" w:hAnsi="Aptos"/>
                 <w:sz w:val="16"/>
               </w:rPr>
-              <w:t>experiments/raw-results/atomicbot-turboquant/2026-07-16/acquisition/metrics/AB-07/AB-07-formal-summary.json</w:t>
+              <w:t>experiments/raw-results/retained/atomicbot-turboquant/2026-07-16/acquisition/metrics/AB-07/AB-07-formal-summary.json</w:t>
             </w:r>
           </w:p>
         </w:tc>
@@ -20978,7 +20978,7 @@
                 <w:rFonts w:ascii="Aptos" w:hAnsi="Aptos"/>
                 <w:sz w:val="16"/>
               </w:rPr>
-              <w:t>experiments/raw-results/atomicbot-turboquant/2026-07-16/acquisition/metrics/AB-08Q/AB-08Q-formal-summary.json</w:t>
+              <w:t>experiments/raw-results/retained/atomicbot-turboquant/2026-07-16/acquisition/metrics/AB-08Q/AB-08Q-formal-summary.json</w:t>
             </w:r>
           </w:p>
         </w:tc>
@@ -21059,7 +21059,7 @@
                 <w:rFonts w:ascii="Aptos" w:hAnsi="Aptos"/>
                 <w:sz w:val="16"/>
               </w:rPr>
-              <w:t>experiments/raw-results/atomicbot-turboquant/2026-07-16/acquisition/metrics/AB-02/AB-02-formal-summary.json</w:t>
+              <w:t>experiments/raw-results/retained/atomicbot-turboquant/2026-07-16/acquisition/metrics/AB-02/AB-02-formal-summary.json</w:t>
             </w:r>
           </w:p>
         </w:tc>
@@ -21136,7 +21136,7 @@
                 <w:rFonts w:ascii="Aptos" w:hAnsi="Aptos"/>
                 <w:sz w:val="16"/>
               </w:rPr>
-              <w:t>experiments/raw-results/atomicbot-turboquant/2026-07-16/safety-bypass/AB-15M/cli-throughput/sample-3/events.jsonl</w:t>
+              <w:t>experiments/raw-results/retained/atomicbot-turboquant/2026-07-16/safety-bypass/AB-15M/cli-throughput/sample-3/events.jsonl</w:t>
             </w:r>
           </w:p>
         </w:tc>
@@ -21217,7 +21217,7 @@
                 <w:rFonts w:ascii="Aptos" w:hAnsi="Aptos"/>
                 <w:sz w:val="16"/>
               </w:rPr>
-              <w:t>experiments/raw-results/atomicbot-turboquant/2026-07-16/safety-bypass/AB-15M/cli-throughput/sample-1/events.jsonl</w:t>
+              <w:t>experiments/raw-results/retained/atomicbot-turboquant/2026-07-16/safety-bypass/AB-15M/cli-throughput/sample-1/events.jsonl</w:t>
             </w:r>
           </w:p>
         </w:tc>
@@ -21294,7 +21294,7 @@
                 <w:rFonts w:ascii="Aptos" w:hAnsi="Aptos"/>
                 <w:sz w:val="16"/>
               </w:rPr>
-              <w:t>experiments/raw-results/atomicbot-turboquant/2026-07-16/safety-bypass/AB-KV8-F16-4K/cli-throughput/sample-1/events.jsonl</w:t>
+              <w:t>experiments/raw-results/retained/atomicbot-turboquant/2026-07-16/safety-bypass/AB-KV8-F16-4K/cli-throughput/sample-1/events.jsonl</w:t>
             </w:r>
           </w:p>
         </w:tc>
@@ -21375,7 +21375,7 @@
                 <w:rFonts w:ascii="Aptos" w:hAnsi="Aptos"/>
                 <w:sz w:val="16"/>
               </w:rPr>
-              <w:t>experiments/raw-results/atomicbot-turboquant/2026-07-16/acquisition/metrics/AB-11/AB-11-formal-summary.json</w:t>
+              <w:t>experiments/raw-results/retained/atomicbot-turboquant/2026-07-16/acquisition/metrics/AB-11/AB-11-formal-summary.json</w:t>
             </w:r>
           </w:p>
         </w:tc>
@@ -21452,7 +21452,7 @@
                 <w:rFonts w:ascii="Aptos" w:hAnsi="Aptos"/>
                 <w:sz w:val="16"/>
               </w:rPr>
-              <w:t>experiments/raw-results/atomicbot-turboquant/2026-07-16/acquisition/metrics/AB-03/AB-03-formal-summary.json</w:t>
+              <w:t>experiments/raw-results/retained/atomicbot-turboquant/2026-07-16/acquisition/metrics/AB-03/AB-03-formal-summary.json</w:t>
             </w:r>
           </w:p>
         </w:tc>
@@ -21533,7 +21533,7 @@
                 <w:rFonts w:ascii="Aptos" w:hAnsi="Aptos"/>
                 <w:sz w:val="16"/>
               </w:rPr>
-              <w:t>experiments/raw-results/atomicbot-turboquant/2026-07-16/safety-bypass/AB-KV8-F16-4K/cli-throughput/sample-3/events.jsonl</w:t>
+              <w:t>experiments/raw-results/retained/atomicbot-turboquant/2026-07-16/safety-bypass/AB-KV8-F16-4K/cli-throughput/sample-3/events.jsonl</w:t>
             </w:r>
           </w:p>
         </w:tc>
@@ -21610,7 +21610,7 @@
                 <w:rFonts w:ascii="Aptos" w:hAnsi="Aptos"/>
                 <w:sz w:val="16"/>
               </w:rPr>
-              <w:t>experiments/raw-results/atomicbot-turboquant/2026-07-16/acquisition/metrics/AB-13/AB-13-formal-summary.json</w:t>
+              <w:t>experiments/raw-results/retained/atomicbot-turboquant/2026-07-16/acquisition/metrics/AB-13/AB-13-formal-summary.json</w:t>
             </w:r>
           </w:p>
         </w:tc>
@@ -21691,7 +21691,7 @@
                 <w:rFonts w:ascii="Aptos" w:hAnsi="Aptos"/>
                 <w:sz w:val="16"/>
               </w:rPr>
-              <w:t>experiments/raw-results/atomicbot-turboquant/2026-07-16/acquisition/metrics/AB-08F/AB-08F-formal-summary.json</w:t>
+              <w:t>experiments/raw-results/retained/atomicbot-turboquant/2026-07-16/acquisition/metrics/AB-08F/AB-08F-formal-summary.json</w:t>
             </w:r>
           </w:p>
         </w:tc>
@@ -21768,7 +21768,7 @@
                 <w:rFonts w:ascii="Aptos" w:hAnsi="Aptos"/>
                 <w:sz w:val="16"/>
               </w:rPr>
-              <w:t>experiments/raw-results/atomicbot-turboquant/2026-07-16/safety-bypass/AB-15M/cli-throughput/sample-2/events.jsonl</w:t>
+              <w:t>experiments/raw-results/retained/atomicbot-turboquant/2026-07-16/safety-bypass/AB-15M/cli-throughput/sample-2/events.jsonl</w:t>
             </w:r>
           </w:p>
         </w:tc>
@@ -21849,7 +21849,7 @@
                 <w:rFonts w:ascii="Aptos" w:hAnsi="Aptos"/>
                 <w:sz w:val="16"/>
               </w:rPr>
-              <w:t>experiments/raw-results/atomicbot-turboquant/2026-07-16/acquisition/metrics/AB-06/AB-06-formal-summary.json</w:t>
+              <w:t>experiments/raw-results/retained/atomicbot-turboquant/2026-07-16/acquisition/metrics/AB-06/AB-06-formal-summary.json</w:t>
             </w:r>
           </w:p>
         </w:tc>
@@ -21926,7 +21926,7 @@
                 <w:rFonts w:ascii="Aptos" w:hAnsi="Aptos"/>
                 <w:sz w:val="16"/>
               </w:rPr>
-              <w:t>experiments/raw-results/atomicbot-turboquant/2026-07-16/acquisition/metrics/AB-05/AB-05-formal-summary.json</w:t>
+              <w:t>experiments/raw-results/retained/atomicbot-turboquant/2026-07-16/acquisition/metrics/AB-05/AB-05-formal-summary.json</w:t>
             </w:r>
           </w:p>
         </w:tc>
@@ -22007,7 +22007,7 @@
                 <w:rFonts w:ascii="Aptos" w:hAnsi="Aptos"/>
                 <w:sz w:val="16"/>
               </w:rPr>
-              <w:t>experiments/raw-results/atomicbot-turboquant/2026-07-16/acquisition/metrics/AB-01/AB-01-formal-summary.json</w:t>
+              <w:t>experiments/raw-results/retained/atomicbot-turboquant/2026-07-16/acquisition/metrics/AB-01/AB-01-formal-summary.json</w:t>
             </w:r>
           </w:p>
         </w:tc>
@@ -22084,7 +22084,7 @@
                 <w:rFonts w:ascii="Aptos" w:hAnsi="Aptos"/>
                 <w:sz w:val="16"/>
               </w:rPr>
-              <w:t>experiments/raw-results/atomicbot-turboquant/2026-07-16/acquisition/results/AtomicBot_Master_Summary.json</w:t>
+              <w:t>experiments/raw-results/retained/atomicbot-turboquant/2026-07-16/acquisition/results/AtomicBot_Master_Summary.json</w:t>
             </w:r>
           </w:p>
         </w:tc>
@@ -22165,7 +22165,7 @@
                 <w:rFonts w:ascii="Aptos" w:hAnsi="Aptos"/>
                 <w:sz w:val="16"/>
               </w:rPr>
-              <w:t>experiments/raw-results/atomicbot-turboquant/2026-07-16/acquisition/results/AtomicBot_Model_Manifest.json</w:t>
+              <w:t>experiments/raw-results/retained/atomicbot-turboquant/2026-07-16/acquisition/results/AtomicBot_Model_Manifest.json</w:t>
             </w:r>
           </w:p>
         </w:tc>
@@ -22323,7 +22323,7 @@
                 <w:rFonts w:ascii="Aptos" w:hAnsi="Aptos"/>
                 <w:sz w:val="16"/>
               </w:rPr>
-              <w:t>experiments/raw-results/atomicbot-turboquant/2026-07-16/acquisition/results/AtomicBot_Perplexity_Summary.json</w:t>
+              <w:t>experiments/raw-results/retained/atomicbot-turboquant/2026-07-16/acquisition/results/AtomicBot_Perplexity_Summary.json</w:t>
             </w:r>
           </w:p>
         </w:tc>
@@ -22481,7 +22481,7 @@
                 <w:rFonts w:ascii="Aptos" w:hAnsi="Aptos"/>
                 <w:sz w:val="16"/>
               </w:rPr>
-              <w:t>experiments/raw-results/atomicbot-turboquant/2026-07-17/quality-all-rows/quality-adjudications.json</w:t>
+              <w:t>experiments/raw-results/retained/atomicbot-turboquant/2026-07-17/quality-all-rows/quality-adjudications.json</w:t>
             </w:r>
           </w:p>
         </w:tc>
@@ -22558,7 +22558,7 @@
                 <w:rFonts w:ascii="Aptos" w:hAnsi="Aptos"/>
                 <w:sz w:val="16"/>
               </w:rPr>
-              <w:t>experiments/raw-results/atomicbot-turboquant/2026-07-17/quality-all-rows/AB-01/P4.json</w:t>
+              <w:t>experiments/raw-results/retained/atomicbot-turboquant/2026-07-17/quality-all-rows/AB-01/P4.json</w:t>
             </w:r>
           </w:p>
         </w:tc>
@@ -22639,7 +22639,7 @@
                 <w:rFonts w:ascii="Aptos" w:hAnsi="Aptos"/>
                 <w:sz w:val="16"/>
               </w:rPr>
-              <w:t>experiments/raw-results/atomicbot-turboquant/2026-07-17/quality-all-rows/AB-06/P6.json</w:t>
+              <w:t>experiments/raw-results/retained/atomicbot-turboquant/2026-07-17/quality-all-rows/AB-06/P6.json</w:t>
             </w:r>
           </w:p>
         </w:tc>
@@ -22716,7 +22716,7 @@
                 <w:rFonts w:ascii="Aptos" w:hAnsi="Aptos"/>
                 <w:sz w:val="16"/>
               </w:rPr>
-              <w:t>experiments/raw-results/atomicbot-turboquant/2026-07-17/quality-all-rows/AB-15/P1.json</w:t>
+              <w:t>experiments/raw-results/retained/atomicbot-turboquant/2026-07-17/quality-all-rows/AB-15/P1.json</w:t>
             </w:r>
           </w:p>
         </w:tc>
@@ -22797,7 +22797,7 @@
                 <w:rFonts w:ascii="Aptos" w:hAnsi="Aptos"/>
                 <w:sz w:val="16"/>
               </w:rPr>
-              <w:t>experiments/raw-results/atomicbot-turboquant/2026-07-17/quality-all-rows/AB-13/P2.json</w:t>
+              <w:t>experiments/raw-results/retained/atomicbot-turboquant/2026-07-17/quality-all-rows/AB-13/P2.json</w:t>
             </w:r>
           </w:p>
         </w:tc>
@@ -22874,7 +22874,7 @@
                 <w:rFonts w:ascii="Aptos" w:hAnsi="Aptos"/>
                 <w:sz w:val="16"/>
               </w:rPr>
-              <w:t>experiments/raw-results/atomicbot-turboquant/2026-07-17/quality-all-rows/AB-10/P6.json</w:t>
+              <w:t>experiments/raw-results/retained/atomicbot-turboquant/2026-07-17/quality-all-rows/AB-10/P6.json</w:t>
             </w:r>
           </w:p>
         </w:tc>
@@ -22955,7 +22955,7 @@
                 <w:rFonts w:ascii="Aptos" w:hAnsi="Aptos"/>
                 <w:sz w:val="16"/>
               </w:rPr>
-              <w:t>experiments/raw-results/atomicbot-turboquant/2026-07-17/quality-all-rows/AB-11/P3.json</w:t>
+              <w:t>experiments/raw-results/retained/atomicbot-turboquant/2026-07-17/quality-all-rows/AB-11/P3.json</w:t>
             </w:r>
           </w:p>
         </w:tc>
@@ -23032,7 +23032,7 @@
                 <w:rFonts w:ascii="Aptos" w:hAnsi="Aptos"/>
                 <w:sz w:val="16"/>
               </w:rPr>
-              <w:t>experiments/raw-results/atomicbot-turboquant/2026-07-17/quality-all-rows/AB-15M/P6.json</w:t>
+              <w:t>experiments/raw-results/retained/atomicbot-turboquant/2026-07-17/quality-all-rows/AB-15M/P6.json</w:t>
             </w:r>
           </w:p>
         </w:tc>
@@ -23113,7 +23113,7 @@
                 <w:rFonts w:ascii="Aptos" w:hAnsi="Aptos"/>
                 <w:sz w:val="16"/>
               </w:rPr>
-              <w:t>experiments/raw-results/atomicbot-turboquant/2026-07-17/quality-all-rows/AB-05/P6.json</w:t>
+              <w:t>experiments/raw-results/retained/atomicbot-turboquant/2026-07-17/quality-all-rows/AB-05/P6.json</w:t>
             </w:r>
           </w:p>
         </w:tc>
@@ -23190,7 +23190,7 @@
                 <w:rFonts w:ascii="Aptos" w:hAnsi="Aptos"/>
                 <w:sz w:val="16"/>
               </w:rPr>
-              <w:t>experiments/raw-results/atomicbot-turboquant/2026-07-17/quality-all-rows/AB-14/P5.json</w:t>
+              <w:t>experiments/raw-results/retained/atomicbot-turboquant/2026-07-17/quality-all-rows/AB-14/P5.json</w:t>
             </w:r>
           </w:p>
         </w:tc>
@@ -23271,7 +23271,7 @@
                 <w:rFonts w:ascii="Aptos" w:hAnsi="Aptos"/>
                 <w:sz w:val="16"/>
               </w:rPr>
-              <w:t>experiments/raw-results/atomicbot-turboquant/2026-07-17/quality-all-rows/AB-08F/P5.json</w:t>
+              <w:t>experiments/raw-results/retained/atomicbot-turboquant/2026-07-17/quality-all-rows/AB-08F/P5.json</w:t>
             </w:r>
           </w:p>
         </w:tc>
@@ -23348,7 +23348,7 @@
                 <w:rFonts w:ascii="Aptos" w:hAnsi="Aptos"/>
                 <w:sz w:val="16"/>
               </w:rPr>
-              <w:t>experiments/raw-results/atomicbot-turboquant/2026-07-17/quality-all-rows/AB-15/P3.json</w:t>
+              <w:t>experiments/raw-results/retained/atomicbot-turboquant/2026-07-17/quality-all-rows/AB-15/P3.json</w:t>
             </w:r>
           </w:p>
         </w:tc>
@@ -23429,7 +23429,7 @@
                 <w:rFonts w:ascii="Aptos" w:hAnsi="Aptos"/>
                 <w:sz w:val="16"/>
               </w:rPr>
-              <w:t>experiments/raw-results/atomicbot-turboquant/2026-07-17/quality-all-rows/AB-10/P1.json</w:t>
+              <w:t>experiments/raw-results/retained/atomicbot-turboquant/2026-07-17/quality-all-rows/AB-10/P1.json</w:t>
             </w:r>
           </w:p>
         </w:tc>
@@ -23506,7 +23506,7 @@
                 <w:rFonts w:ascii="Aptos" w:hAnsi="Aptos"/>
                 <w:sz w:val="16"/>
               </w:rPr>
-              <w:t>experiments/raw-results/atomicbot-turboquant/2026-07-17/quality-all-rows/AB-01/P3.json</w:t>
+              <w:t>experiments/raw-results/retained/atomicbot-turboquant/2026-07-17/quality-all-rows/AB-01/P3.json</w:t>
             </w:r>
           </w:p>
         </w:tc>
@@ -23587,7 +23587,7 @@
                 <w:rFonts w:ascii="Aptos" w:hAnsi="Aptos"/>
                 <w:sz w:val="16"/>
               </w:rPr>
-              <w:t>experiments/raw-results/atomicbot-turboquant/2026-07-17/quality-all-rows/AB-15/P4.json</w:t>
+              <w:t>experiments/raw-results/retained/atomicbot-turboquant/2026-07-17/quality-all-rows/AB-15/P4.json</w:t>
             </w:r>
           </w:p>
         </w:tc>
@@ -23664,7 +23664,7 @@
                 <w:rFonts w:ascii="Aptos" w:hAnsi="Aptos"/>
                 <w:sz w:val="16"/>
               </w:rPr>
-              <w:t>experiments/raw-results/atomicbot-turboquant/2026-07-17/quality-all-rows/AB-05/P5.json</w:t>
+              <w:t>experiments/raw-results/retained/atomicbot-turboquant/2026-07-17/quality-all-rows/AB-05/P5.json</w:t>
             </w:r>
           </w:p>
         </w:tc>
@@ -23745,7 +23745,7 @@
                 <w:rFonts w:ascii="Aptos" w:hAnsi="Aptos"/>
                 <w:sz w:val="16"/>
               </w:rPr>
-              <w:t>experiments/raw-results/atomicbot-turboquant/2026-07-17/quality-all-rows/AB-KV8-F16-4K/P3.json</w:t>
+              <w:t>experiments/raw-results/retained/atomicbot-turboquant/2026-07-17/quality-all-rows/AB-KV8-F16-4K/P3.json</w:t>
             </w:r>
           </w:p>
         </w:tc>
@@ -23822,7 +23822,7 @@
                 <w:rFonts w:ascii="Aptos" w:hAnsi="Aptos"/>
                 <w:sz w:val="16"/>
               </w:rPr>
-              <w:t>experiments/raw-results/atomicbot-turboquant/2026-07-17/quality-all-rows/AB-06/P3.json</w:t>
+              <w:t>experiments/raw-results/retained/atomicbot-turboquant/2026-07-17/quality-all-rows/AB-06/P3.json</w:t>
             </w:r>
           </w:p>
         </w:tc>
@@ -23903,7 +23903,7 @@
                 <w:rFonts w:ascii="Aptos" w:hAnsi="Aptos"/>
                 <w:sz w:val="16"/>
               </w:rPr>
-              <w:t>experiments/raw-results/atomicbot-turboquant/2026-07-17/quality-all-rows/AB-12/P4.json</w:t>
+              <w:t>experiments/raw-results/retained/atomicbot-turboquant/2026-07-17/quality-all-rows/AB-12/P4.json</w:t>
             </w:r>
           </w:p>
         </w:tc>
@@ -23980,7 +23980,7 @@
                 <w:rFonts w:ascii="Aptos" w:hAnsi="Aptos"/>
                 <w:sz w:val="16"/>
               </w:rPr>
-              <w:t>experiments/raw-results/atomicbot-turboquant/2026-07-17/quality-all-rows/AB-04/P6.json</w:t>
+              <w:t>experiments/raw-results/retained/atomicbot-turboquant/2026-07-17/quality-all-rows/AB-04/P6.json</w:t>
             </w:r>
           </w:p>
         </w:tc>
@@ -24061,7 +24061,7 @@
                 <w:rFonts w:ascii="Aptos" w:hAnsi="Aptos"/>
                 <w:sz w:val="16"/>
               </w:rPr>
-              <w:t>experiments/raw-results/atomicbot-turboquant/2026-07-17/quality-all-rows/AB-05/P1.json</w:t>
+              <w:t>experiments/raw-results/retained/atomicbot-turboquant/2026-07-17/quality-all-rows/AB-05/P1.json</w:t>
             </w:r>
           </w:p>
         </w:tc>
@@ -24138,7 +24138,7 @@
                 <w:rFonts w:ascii="Aptos" w:hAnsi="Aptos"/>
                 <w:sz w:val="16"/>
               </w:rPr>
-              <w:t>experiments/raw-results/atomicbot-turboquant/2026-07-17/quality-all-rows/AB-13/P4.json</w:t>
+              <w:t>experiments/raw-results/retained/atomicbot-turboquant/2026-07-17/quality-all-rows/AB-13/P4.json</w:t>
             </w:r>
           </w:p>
         </w:tc>
@@ -24219,7 +24219,7 @@
                 <w:rFonts w:ascii="Aptos" w:hAnsi="Aptos"/>
                 <w:sz w:val="16"/>
               </w:rPr>
-              <w:t>experiments/raw-results/atomicbot-turboquant/2026-07-17/quality-all-rows/AB-13/P3.json</w:t>
+              <w:t>experiments/raw-results/retained/atomicbot-turboquant/2026-07-17/quality-all-rows/AB-13/P3.json</w:t>
             </w:r>
           </w:p>
         </w:tc>
@@ -24296,7 +24296,7 @@
                 <w:rFonts w:ascii="Aptos" w:hAnsi="Aptos"/>
                 <w:sz w:val="16"/>
               </w:rPr>
-              <w:t>experiments/raw-results/atomicbot-turboquant/2026-07-17/quality-all-rows/AB-KV3-F16-4K/P2.json</w:t>
+              <w:t>experiments/raw-results/retained/atomicbot-turboquant/2026-07-17/quality-all-rows/AB-KV3-F16-4K/P2.json</w:t>
             </w:r>
           </w:p>
         </w:tc>
@@ -24377,7 +24377,7 @@
                 <w:rFonts w:ascii="Aptos" w:hAnsi="Aptos"/>
                 <w:sz w:val="16"/>
               </w:rPr>
-              <w:t>experiments/raw-results/atomicbot-turboquant/2026-07-17/quality-all-rows/AB-08Q/P4.json</w:t>
+              <w:t>experiments/raw-results/retained/atomicbot-turboquant/2026-07-17/quality-all-rows/AB-08Q/P4.json</w:t>
             </w:r>
           </w:p>
         </w:tc>
@@ -24454,7 +24454,7 @@
                 <w:rFonts w:ascii="Aptos" w:hAnsi="Aptos"/>
                 <w:sz w:val="16"/>
               </w:rPr>
-              <w:t>experiments/raw-results/atomicbot-turboquant/2026-07-17/quality-all-rows/AB-08F/P4.json</w:t>
+              <w:t>experiments/raw-results/retained/atomicbot-turboquant/2026-07-17/quality-all-rows/AB-08F/P4.json</w:t>
             </w:r>
           </w:p>
         </w:tc>
@@ -24535,7 +24535,7 @@
                 <w:rFonts w:ascii="Aptos" w:hAnsi="Aptos"/>
                 <w:sz w:val="16"/>
               </w:rPr>
-              <w:t>experiments/raw-results/atomicbot-turboquant/2026-07-17/quality-all-rows/AB-04/P1.json</w:t>
+              <w:t>experiments/raw-results/retained/atomicbot-turboquant/2026-07-17/quality-all-rows/AB-04/P1.json</w:t>
             </w:r>
           </w:p>
         </w:tc>
@@ -24612,7 +24612,7 @@
                 <w:rFonts w:ascii="Aptos" w:hAnsi="Aptos"/>
                 <w:sz w:val="16"/>
               </w:rPr>
-              <w:t>experiments/raw-results/atomicbot-turboquant/2026-07-17/quality-all-rows/AB-06/P4.json</w:t>
+              <w:t>experiments/raw-results/retained/atomicbot-turboquant/2026-07-17/quality-all-rows/AB-06/P4.json</w:t>
             </w:r>
           </w:p>
         </w:tc>
@@ -24693,7 +24693,7 @@
                 <w:rFonts w:ascii="Aptos" w:hAnsi="Aptos"/>
                 <w:sz w:val="16"/>
               </w:rPr>
-              <w:t>experiments/raw-results/atomicbot-turboquant/2026-07-17/quality-all-rows/AB-10/P2.json</w:t>
+              <w:t>experiments/raw-results/retained/atomicbot-turboquant/2026-07-17/quality-all-rows/AB-10/P2.json</w:t>
             </w:r>
           </w:p>
         </w:tc>
@@ -24770,7 +24770,7 @@
                 <w:rFonts w:ascii="Aptos" w:hAnsi="Aptos"/>
                 <w:sz w:val="16"/>
               </w:rPr>
-              <w:t>experiments/raw-results/atomicbot-turboquant/2026-07-17/quality-all-rows/AB-08F/P6.json</w:t>
+              <w:t>experiments/raw-results/retained/atomicbot-turboquant/2026-07-17/quality-all-rows/AB-08F/P6.json</w:t>
             </w:r>
           </w:p>
         </w:tc>
@@ -24851,7 +24851,7 @@
                 <w:rFonts w:ascii="Aptos" w:hAnsi="Aptos"/>
                 <w:sz w:val="16"/>
               </w:rPr>
-              <w:t>experiments/raw-results/atomicbot-turboquant/2026-07-17/quality-all-rows/AB-07/P4.json</w:t>
+              <w:t>experiments/raw-results/retained/atomicbot-turboquant/2026-07-17/quality-all-rows/AB-07/P4.json</w:t>
             </w:r>
           </w:p>
         </w:tc>
@@ -24928,7 +24928,7 @@
                 <w:rFonts w:ascii="Aptos" w:hAnsi="Aptos"/>
                 <w:sz w:val="16"/>
               </w:rPr>
-              <w:t>experiments/raw-results/atomicbot-turboquant/2026-07-17/quality-all-rows/AB-14/P4.json</w:t>
+              <w:t>experiments/raw-results/retained/atomicbot-turboquant/2026-07-17/quality-all-rows/AB-14/P4.json</w:t>
             </w:r>
           </w:p>
         </w:tc>
@@ -25009,7 +25009,7 @@
                 <w:rFonts w:ascii="Aptos" w:hAnsi="Aptos"/>
                 <w:sz w:val="16"/>
               </w:rPr>
-              <w:t>experiments/raw-results/atomicbot-turboquant/2026-07-17/quality-all-rows/AB-15M/P5.json</w:t>
+              <w:t>experiments/raw-results/retained/atomicbot-turboquant/2026-07-17/quality-all-rows/AB-15M/P5.json</w:t>
             </w:r>
           </w:p>
         </w:tc>
@@ -25086,7 +25086,7 @@
                 <w:rFonts w:ascii="Aptos" w:hAnsi="Aptos"/>
                 <w:sz w:val="16"/>
               </w:rPr>
-              <w:t>experiments/raw-results/atomicbot-turboquant/2026-07-17/quality-all-rows/AB-02/P3.json</w:t>
+              <w:t>experiments/raw-results/retained/atomicbot-turboquant/2026-07-17/quality-all-rows/AB-02/P3.json</w:t>
             </w:r>
           </w:p>
         </w:tc>
@@ -25167,7 +25167,7 @@
                 <w:rFonts w:ascii="Aptos" w:hAnsi="Aptos"/>
                 <w:sz w:val="16"/>
               </w:rPr>
-              <w:t>experiments/raw-results/atomicbot-turboquant/2026-07-17/quality-all-rows/AB-12/P3.json</w:t>
+              <w:t>experiments/raw-results/retained/atomicbot-turboquant/2026-07-17/quality-all-rows/AB-12/P3.json</w:t>
             </w:r>
           </w:p>
         </w:tc>
@@ -25244,7 +25244,7 @@
                 <w:rFonts w:ascii="Aptos" w:hAnsi="Aptos"/>
                 <w:sz w:val="16"/>
               </w:rPr>
-              <w:t>experiments/raw-results/atomicbot-turboquant/2026-07-17/quality-all-rows/AB-12/P1.json</w:t>
+              <w:t>experiments/raw-results/retained/atomicbot-turboquant/2026-07-17/quality-all-rows/AB-12/P1.json</w:t>
             </w:r>
           </w:p>
         </w:tc>
@@ -25325,7 +25325,7 @@
                 <w:rFonts w:ascii="Aptos" w:hAnsi="Aptos"/>
                 <w:sz w:val="16"/>
               </w:rPr>
-              <w:t>experiments/raw-results/atomicbot-turboquant/2026-07-17/quality-all-rows/AB-05/P3.json</w:t>
+              <w:t>experiments/raw-results/retained/atomicbot-turboquant/2026-07-17/quality-all-rows/AB-05/P3.json</w:t>
             </w:r>
           </w:p>
         </w:tc>
@@ -25402,7 +25402,7 @@
                 <w:rFonts w:ascii="Aptos" w:hAnsi="Aptos"/>
                 <w:sz w:val="16"/>
               </w:rPr>
-              <w:t>experiments/raw-results/atomicbot-turboquant/2026-07-17/quality-all-rows/AB-11/P1.json</w:t>
+              <w:t>experiments/raw-results/retained/atomicbot-turboquant/2026-07-17/quality-all-rows/AB-11/P1.json</w:t>
             </w:r>
           </w:p>
         </w:tc>
@@ -25483,7 +25483,7 @@
                 <w:rFonts w:ascii="Aptos" w:hAnsi="Aptos"/>
                 <w:sz w:val="16"/>
               </w:rPr>
-              <w:t>experiments/raw-results/atomicbot-turboquant/2026-07-17/quality-all-rows/AB-15M/P2.json</w:t>
+              <w:t>experiments/raw-results/retained/atomicbot-turboquant/2026-07-17/quality-all-rows/AB-15M/P2.json</w:t>
             </w:r>
           </w:p>
         </w:tc>
@@ -25560,7 +25560,7 @@
                 <w:rFonts w:ascii="Aptos" w:hAnsi="Aptos"/>
                 <w:sz w:val="16"/>
               </w:rPr>
-              <w:t>experiments/raw-results/atomicbot-turboquant/2026-07-17/quality-all-rows/AB-15/P2.json</w:t>
+              <w:t>experiments/raw-results/retained/atomicbot-turboquant/2026-07-17/quality-all-rows/AB-15/P2.json</w:t>
             </w:r>
           </w:p>
         </w:tc>
@@ -25641,7 +25641,7 @@
                 <w:rFonts w:ascii="Aptos" w:hAnsi="Aptos"/>
                 <w:sz w:val="16"/>
               </w:rPr>
-              <w:t>experiments/raw-results/atomicbot-turboquant/2026-07-17/quality-all-rows/AB-14/P3.json</w:t>
+              <w:t>experiments/raw-results/retained/atomicbot-turboquant/2026-07-17/quality-all-rows/AB-14/P3.json</w:t>
             </w:r>
           </w:p>
         </w:tc>
@@ -25718,7 +25718,7 @@
                 <w:rFonts w:ascii="Aptos" w:hAnsi="Aptos"/>
                 <w:sz w:val="16"/>
               </w:rPr>
-              <w:t>experiments/raw-results/atomicbot-turboquant/2026-07-17/quality-all-rows/AB-11/P5.json</w:t>
+              <w:t>experiments/raw-results/retained/atomicbot-turboquant/2026-07-17/quality-all-rows/AB-11/P5.json</w:t>
             </w:r>
           </w:p>
         </w:tc>
@@ -25799,7 +25799,7 @@
                 <w:rFonts w:ascii="Aptos" w:hAnsi="Aptos"/>
                 <w:sz w:val="16"/>
               </w:rPr>
-              <w:t>experiments/raw-results/atomicbot-turboquant/2026-07-17/quality-all-rows/AB-KV8-F16-4K/P5.json</w:t>
+              <w:t>experiments/raw-results/retained/atomicbot-turboquant/2026-07-17/quality-all-rows/AB-KV8-F16-4K/P5.json</w:t>
             </w:r>
           </w:p>
         </w:tc>
@@ -25876,7 +25876,7 @@
                 <w:rFonts w:ascii="Aptos" w:hAnsi="Aptos"/>
                 <w:sz w:val="16"/>
               </w:rPr>
-              <w:t>experiments/raw-results/atomicbot-turboquant/2026-07-17/quality-all-rows/AB-02/P6.json</w:t>
+              <w:t>experiments/raw-results/retained/atomicbot-turboquant/2026-07-17/quality-all-rows/AB-02/P6.json</w:t>
             </w:r>
           </w:p>
         </w:tc>
@@ -25957,7 +25957,7 @@
                 <w:rFonts w:ascii="Aptos" w:hAnsi="Aptos"/>
                 <w:sz w:val="16"/>
               </w:rPr>
-              <w:t>experiments/raw-results/atomicbot-turboquant/2026-07-17/quality-all-rows/AB-KV8-F16-4K/P4.json</w:t>
+              <w:t>experiments/raw-results/retained/atomicbot-turboquant/2026-07-17/quality-all-rows/AB-KV8-F16-4K/P4.json</w:t>
             </w:r>
           </w:p>
         </w:tc>
@@ -26034,7 +26034,7 @@
                 <w:rFonts w:ascii="Aptos" w:hAnsi="Aptos"/>
                 <w:sz w:val="16"/>
               </w:rPr>
-              <w:t>experiments/raw-results/atomicbot-turboquant/2026-07-17/quality-all-rows/AB-08F/P1.json</w:t>
+              <w:t>experiments/raw-results/retained/atomicbot-turboquant/2026-07-17/quality-all-rows/AB-08F/P1.json</w:t>
             </w:r>
           </w:p>
         </w:tc>
@@ -26115,7 +26115,7 @@
                 <w:rFonts w:ascii="Aptos" w:hAnsi="Aptos"/>
                 <w:sz w:val="16"/>
               </w:rPr>
-              <w:t>experiments/raw-results/atomicbot-turboquant/2026-07-17/quality-all-rows/AB-03/P1.json</w:t>
+              <w:t>experiments/raw-results/retained/atomicbot-turboquant/2026-07-17/quality-all-rows/AB-03/P1.json</w:t>
             </w:r>
           </w:p>
         </w:tc>
@@ -26192,7 +26192,7 @@
                 <w:rFonts w:ascii="Aptos" w:hAnsi="Aptos"/>
                 <w:sz w:val="16"/>
               </w:rPr>
-              <w:t>experiments/raw-results/atomicbot-turboquant/2026-07-17/quality-all-rows/AB-KV8-F16-4K/P1.json</w:t>
+              <w:t>experiments/raw-results/retained/atomicbot-turboquant/2026-07-17/quality-all-rows/AB-KV8-F16-4K/P1.json</w:t>
             </w:r>
           </w:p>
         </w:tc>
@@ -26273,7 +26273,7 @@
                 <w:rFonts w:ascii="Aptos" w:hAnsi="Aptos"/>
                 <w:sz w:val="16"/>
               </w:rPr>
-              <w:t>experiments/raw-results/atomicbot-turboquant/2026-07-17/quality-all-rows/AB-06/P1.json</w:t>
+              <w:t>experiments/raw-results/retained/atomicbot-turboquant/2026-07-17/quality-all-rows/AB-06/P1.json</w:t>
             </w:r>
           </w:p>
         </w:tc>
@@ -26350,7 +26350,7 @@
                 <w:rFonts w:ascii="Aptos" w:hAnsi="Aptos"/>
                 <w:sz w:val="16"/>
               </w:rPr>
-              <w:t>experiments/raw-results/atomicbot-turboquant/2026-07-17/quality-all-rows/AB-09/P6.json</w:t>
+              <w:t>experiments/raw-results/retained/atomicbot-turboquant/2026-07-17/quality-all-rows/AB-09/P6.json</w:t>
             </w:r>
           </w:p>
         </w:tc>
@@ -26431,7 +26431,7 @@
                 <w:rFonts w:ascii="Aptos" w:hAnsi="Aptos"/>
                 <w:sz w:val="16"/>
               </w:rPr>
-              <w:t>experiments/raw-results/atomicbot-turboquant/2026-07-17/quality-all-rows/AB-08F/P2.json</w:t>
+              <w:t>experiments/raw-results/retained/atomicbot-turboquant/2026-07-17/quality-all-rows/AB-08F/P2.json</w:t>
             </w:r>
           </w:p>
         </w:tc>
@@ -26508,7 +26508,7 @@
                 <w:rFonts w:ascii="Aptos" w:hAnsi="Aptos"/>
                 <w:sz w:val="16"/>
               </w:rPr>
-              <w:t>experiments/raw-results/atomicbot-turboquant/2026-07-17/quality-all-rows/AB-11/P6.json</w:t>
+              <w:t>experiments/raw-results/retained/atomicbot-turboquant/2026-07-17/quality-all-rows/AB-11/P6.json</w:t>
             </w:r>
           </w:p>
         </w:tc>
@@ -26589,7 +26589,7 @@
                 <w:rFonts w:ascii="Aptos" w:hAnsi="Aptos"/>
                 <w:sz w:val="16"/>
               </w:rPr>
-              <w:t>experiments/raw-results/atomicbot-turboquant/2026-07-17/quality-all-rows/AB-KV3-F16-4K/P3.json</w:t>
+              <w:t>experiments/raw-results/retained/atomicbot-turboquant/2026-07-17/quality-all-rows/AB-KV3-F16-4K/P3.json</w:t>
             </w:r>
           </w:p>
         </w:tc>
@@ -26666,7 +26666,7 @@
                 <w:rFonts w:ascii="Aptos" w:hAnsi="Aptos"/>
                 <w:sz w:val="16"/>
               </w:rPr>
-              <w:t>experiments/raw-results/atomicbot-turboquant/2026-07-17/quality-all-rows/AB-08Q/P5.json</w:t>
+              <w:t>experiments/raw-results/retained/atomicbot-turboquant/2026-07-17/quality-all-rows/AB-08Q/P5.json</w:t>
             </w:r>
           </w:p>
         </w:tc>
@@ -26747,7 +26747,7 @@
                 <w:rFonts w:ascii="Aptos" w:hAnsi="Aptos"/>
                 <w:sz w:val="16"/>
               </w:rPr>
-              <w:t>experiments/raw-results/atomicbot-turboquant/2026-07-17/quality-all-rows/AB-09/P1.json</w:t>
+              <w:t>experiments/raw-results/retained/atomicbot-turboquant/2026-07-17/quality-all-rows/AB-09/P1.json</w:t>
             </w:r>
           </w:p>
         </w:tc>
@@ -26824,7 +26824,7 @@
                 <w:rFonts w:ascii="Aptos" w:hAnsi="Aptos"/>
                 <w:sz w:val="16"/>
               </w:rPr>
-              <w:t>experiments/raw-results/atomicbot-turboquant/2026-07-17/quality-all-rows/AB-07/P1.json</w:t>
+              <w:t>experiments/raw-results/retained/atomicbot-turboquant/2026-07-17/quality-all-rows/AB-07/P1.json</w:t>
             </w:r>
           </w:p>
         </w:tc>
@@ -26905,7 +26905,7 @@
                 <w:rFonts w:ascii="Aptos" w:hAnsi="Aptos"/>
                 <w:sz w:val="16"/>
               </w:rPr>
-              <w:t>experiments/raw-results/atomicbot-turboquant/2026-07-17/quality-all-rows/AB-09/P4.json</w:t>
+              <w:t>experiments/raw-results/retained/atomicbot-turboquant/2026-07-17/quality-all-rows/AB-09/P4.json</w:t>
             </w:r>
           </w:p>
         </w:tc>
@@ -26982,7 +26982,7 @@
                 <w:rFonts w:ascii="Aptos" w:hAnsi="Aptos"/>
                 <w:sz w:val="16"/>
               </w:rPr>
-              <w:t>experiments/raw-results/atomicbot-turboquant/2026-07-17/quality-all-rows/AB-09/P5.json</w:t>
+              <w:t>experiments/raw-results/retained/atomicbot-turboquant/2026-07-17/quality-all-rows/AB-09/P5.json</w:t>
             </w:r>
           </w:p>
         </w:tc>
@@ -27063,7 +27063,7 @@
                 <w:rFonts w:ascii="Aptos" w:hAnsi="Aptos"/>
                 <w:sz w:val="16"/>
               </w:rPr>
-              <w:t>experiments/raw-results/atomicbot-turboquant/2026-07-17/quality-all-rows/AB-11/P2.json</w:t>
+              <w:t>experiments/raw-results/retained/atomicbot-turboquant/2026-07-17/quality-all-rows/AB-11/P2.json</w:t>
             </w:r>
           </w:p>
         </w:tc>
@@ -27140,7 +27140,7 @@
                 <w:rFonts w:ascii="Aptos" w:hAnsi="Aptos"/>
                 <w:sz w:val="16"/>
               </w:rPr>
-              <w:t>experiments/raw-results/atomicbot-turboquant/2026-07-17/quality-all-rows/AB-01/P1.json</w:t>
+              <w:t>experiments/raw-results/retained/atomicbot-turboquant/2026-07-17/quality-all-rows/AB-01/P1.json</w:t>
             </w:r>
           </w:p>
         </w:tc>
@@ -27221,7 +27221,7 @@
                 <w:rFonts w:ascii="Aptos" w:hAnsi="Aptos"/>
                 <w:sz w:val="16"/>
               </w:rPr>
-              <w:t>experiments/raw-results/atomicbot-turboquant/2026-07-17/quality-all-rows/AB-13/P1.json</w:t>
+              <w:t>experiments/raw-results/retained/atomicbot-turboquant/2026-07-17/quality-all-rows/AB-13/P1.json</w:t>
             </w:r>
           </w:p>
         </w:tc>
@@ -27298,7 +27298,7 @@
                 <w:rFonts w:ascii="Aptos" w:hAnsi="Aptos"/>
                 <w:sz w:val="16"/>
               </w:rPr>
-              <w:t>experiments/raw-results/atomicbot-turboquant/2026-07-17/quality-all-rows/AB-12/P6.json</w:t>
+              <w:t>experiments/raw-results/retained/atomicbot-turboquant/2026-07-17/quality-all-rows/AB-12/P6.json</w:t>
             </w:r>
           </w:p>
         </w:tc>
@@ -27379,7 +27379,7 @@
                 <w:rFonts w:ascii="Aptos" w:hAnsi="Aptos"/>
                 <w:sz w:val="16"/>
               </w:rPr>
-              <w:t>experiments/raw-results/atomicbot-turboquant/2026-07-17/quality-all-rows/AB-05/P4.json</w:t>
+              <w:t>experiments/raw-results/retained/atomicbot-turboquant/2026-07-17/quality-all-rows/AB-05/P4.json</w:t>
             </w:r>
           </w:p>
         </w:tc>
@@ -27456,7 +27456,7 @@
                 <w:rFonts w:ascii="Aptos" w:hAnsi="Aptos"/>
                 <w:sz w:val="16"/>
               </w:rPr>
-              <w:t>experiments/raw-results/atomicbot-turboquant/2026-07-17/quality-all-rows/AB-03/P6.json</w:t>
+              <w:t>experiments/raw-results/retained/atomicbot-turboquant/2026-07-17/quality-all-rows/AB-03/P6.json</w:t>
             </w:r>
           </w:p>
         </w:tc>
@@ -27537,7 +27537,7 @@
                 <w:rFonts w:ascii="Aptos" w:hAnsi="Aptos"/>
                 <w:sz w:val="16"/>
               </w:rPr>
-              <w:t>experiments/raw-results/atomicbot-turboquant/2026-07-17/quality-all-rows/AB-KV8-F16-4K/P6.json</w:t>
+              <w:t>experiments/raw-results/retained/atomicbot-turboquant/2026-07-17/quality-all-rows/AB-KV8-F16-4K/P6.json</w:t>
             </w:r>
           </w:p>
         </w:tc>
@@ -27614,7 +27614,7 @@
                 <w:rFonts w:ascii="Aptos" w:hAnsi="Aptos"/>
                 <w:sz w:val="16"/>
               </w:rPr>
-              <w:t>experiments/raw-results/atomicbot-turboquant/2026-07-17/quality-all-rows/AB-09/P2.json</w:t>
+              <w:t>experiments/raw-results/retained/atomicbot-turboquant/2026-07-17/quality-all-rows/AB-09/P2.json</w:t>
             </w:r>
           </w:p>
         </w:tc>
@@ -27695,7 +27695,7 @@
                 <w:rFonts w:ascii="Aptos" w:hAnsi="Aptos"/>
                 <w:sz w:val="16"/>
               </w:rPr>
-              <w:t>experiments/raw-results/atomicbot-turboquant/2026-07-17/quality-all-rows/AB-03/P4.json</w:t>
+              <w:t>experiments/raw-results/retained/atomicbot-turboquant/2026-07-17/quality-all-rows/AB-03/P4.json</w:t>
             </w:r>
           </w:p>
         </w:tc>
@@ -27772,7 +27772,7 @@
                 <w:rFonts w:ascii="Aptos" w:hAnsi="Aptos"/>
                 <w:sz w:val="16"/>
               </w:rPr>
-              <w:t>experiments/raw-results/atomicbot-turboquant/2026-07-17/quality-all-rows/AB-04/P3.json</w:t>
+              <w:t>experiments/raw-results/retained/atomicbot-turboquant/2026-07-17/quality-all-rows/AB-04/P3.json</w:t>
             </w:r>
           </w:p>
         </w:tc>
@@ -27853,7 +27853,7 @@
                 <w:rFonts w:ascii="Aptos" w:hAnsi="Aptos"/>
                 <w:sz w:val="16"/>
               </w:rPr>
-              <w:t>experiments/raw-results/atomicbot-turboquant/2026-07-17/quality-all-rows/AB-12/P5.json</w:t>
+              <w:t>experiments/raw-results/retained/atomicbot-turboquant/2026-07-17/quality-all-rows/AB-12/P5.json</w:t>
             </w:r>
           </w:p>
         </w:tc>
@@ -27930,7 +27930,7 @@
                 <w:rFonts w:ascii="Aptos" w:hAnsi="Aptos"/>
                 <w:sz w:val="16"/>
               </w:rPr>
-              <w:t>experiments/raw-results/atomicbot-turboquant/2026-07-17/quality-all-rows/AB-08Q/P6.json</w:t>
+              <w:t>experiments/raw-results/retained/atomicbot-turboquant/2026-07-17/quality-all-rows/AB-08Q/P6.json</w:t>
             </w:r>
           </w:p>
         </w:tc>
@@ -28011,7 +28011,7 @@
                 <w:rFonts w:ascii="Aptos" w:hAnsi="Aptos"/>
                 <w:sz w:val="16"/>
               </w:rPr>
-              <w:t>experiments/raw-results/atomicbot-turboquant/2026-07-17/quality-all-rows/AB-03/P3.json</w:t>
+              <w:t>experiments/raw-results/retained/atomicbot-turboquant/2026-07-17/quality-all-rows/AB-03/P3.json</w:t>
             </w:r>
           </w:p>
         </w:tc>
@@ -28088,7 +28088,7 @@
                 <w:rFonts w:ascii="Aptos" w:hAnsi="Aptos"/>
                 <w:sz w:val="16"/>
               </w:rPr>
-              <w:t>experiments/raw-results/atomicbot-turboquant/2026-07-17/quality-all-rows/AB-08Q/P2.json</w:t>
+              <w:t>experiments/raw-results/retained/atomicbot-turboquant/2026-07-17/quality-all-rows/AB-08Q/P2.json</w:t>
             </w:r>
           </w:p>
         </w:tc>
@@ -28169,7 +28169,7 @@
                 <w:rFonts w:ascii="Aptos" w:hAnsi="Aptos"/>
                 <w:sz w:val="16"/>
               </w:rPr>
-              <w:t>experiments/raw-results/atomicbot-turboquant/2026-07-17/quality-all-rows/AB-05/P2.json</w:t>
+              <w:t>experiments/raw-results/retained/atomicbot-turboquant/2026-07-17/quality-all-rows/AB-05/P2.json</w:t>
             </w:r>
           </w:p>
         </w:tc>
@@ -28246,7 +28246,7 @@
                 <w:rFonts w:ascii="Aptos" w:hAnsi="Aptos"/>
                 <w:sz w:val="16"/>
               </w:rPr>
-              <w:t>experiments/raw-results/atomicbot-turboquant/2026-07-17/quality-all-rows/AB-15M/P1.json</w:t>
+              <w:t>experiments/raw-results/retained/atomicbot-turboquant/2026-07-17/quality-all-rows/AB-15M/P1.json</w:t>
             </w:r>
           </w:p>
         </w:tc>
@@ -28327,7 +28327,7 @@
                 <w:rFonts w:ascii="Aptos" w:hAnsi="Aptos"/>
                 <w:sz w:val="16"/>
               </w:rPr>
-              <w:t>experiments/raw-results/atomicbot-turboquant/2026-07-17/quality-all-rows/AB-KV8-F16-4K/P2.json</w:t>
+              <w:t>experiments/raw-results/retained/atomicbot-turboquant/2026-07-17/quality-all-rows/AB-KV8-F16-4K/P2.json</w:t>
             </w:r>
           </w:p>
         </w:tc>
@@ -28404,7 +28404,7 @@
                 <w:rFonts w:ascii="Aptos" w:hAnsi="Aptos"/>
                 <w:sz w:val="16"/>
               </w:rPr>
-              <w:t>experiments/raw-results/atomicbot-turboquant/2026-07-17/quality-all-rows/AB-06/P5.json</w:t>
+              <w:t>experiments/raw-results/retained/atomicbot-turboquant/2026-07-17/quality-all-rows/AB-06/P5.json</w:t>
             </w:r>
           </w:p>
         </w:tc>
@@ -28485,7 +28485,7 @@
                 <w:rFonts w:ascii="Aptos" w:hAnsi="Aptos"/>
                 <w:sz w:val="16"/>
               </w:rPr>
-              <w:t>experiments/raw-results/atomicbot-turboquant/2026-07-17/quality-all-rows/AB-13/P5.json</w:t>
+              <w:t>experiments/raw-results/retained/atomicbot-turboquant/2026-07-17/quality-all-rows/AB-13/P5.json</w:t>
             </w:r>
           </w:p>
         </w:tc>
@@ -28562,7 +28562,7 @@
                 <w:rFonts w:ascii="Aptos" w:hAnsi="Aptos"/>
                 <w:sz w:val="16"/>
               </w:rPr>
-              <w:t>experiments/raw-results/atomicbot-turboquant/2026-07-17/quality-all-rows/AB-04/P2.json</w:t>
+              <w:t>experiments/raw-results/retained/atomicbot-turboquant/2026-07-17/quality-all-rows/AB-04/P2.json</w:t>
             </w:r>
           </w:p>
         </w:tc>
@@ -28643,7 +28643,7 @@
                 <w:rFonts w:ascii="Aptos" w:hAnsi="Aptos"/>
                 <w:sz w:val="16"/>
               </w:rPr>
-              <w:t>experiments/raw-results/atomicbot-turboquant/2026-07-17/quality-all-rows/AB-14/P6.json</w:t>
+              <w:t>experiments/raw-results/retained/atomicbot-turboquant/2026-07-17/quality-all-rows/AB-14/P6.json</w:t>
             </w:r>
           </w:p>
         </w:tc>
@@ -28720,7 +28720,7 @@
                 <w:rFonts w:ascii="Aptos" w:hAnsi="Aptos"/>
                 <w:sz w:val="16"/>
               </w:rPr>
-              <w:t>experiments/raw-results/atomicbot-turboquant/2026-07-17/quality-all-rows/AB-KV3-F16-4K/P1.json</w:t>
+              <w:t>experiments/raw-results/retained/atomicbot-turboquant/2026-07-17/quality-all-rows/AB-KV3-F16-4K/P1.json</w:t>
             </w:r>
           </w:p>
         </w:tc>
@@ -28801,7 +28801,7 @@
                 <w:rFonts w:ascii="Aptos" w:hAnsi="Aptos"/>
                 <w:sz w:val="16"/>
               </w:rPr>
-              <w:t>experiments/raw-results/atomicbot-turboquant/2026-07-17/quality-all-rows/AB-11/P4.json</w:t>
+              <w:t>experiments/raw-results/retained/atomicbot-turboquant/2026-07-17/quality-all-rows/AB-11/P4.json</w:t>
             </w:r>
           </w:p>
         </w:tc>
@@ -28878,7 +28878,7 @@
                 <w:rFonts w:ascii="Aptos" w:hAnsi="Aptos"/>
                 <w:sz w:val="16"/>
               </w:rPr>
-              <w:t>experiments/raw-results/atomicbot-turboquant/2026-07-17/quality-all-rows/AB-09/P3.json</w:t>
+              <w:t>experiments/raw-results/retained/atomicbot-turboquant/2026-07-17/quality-all-rows/AB-09/P3.json</w:t>
             </w:r>
           </w:p>
         </w:tc>
@@ -28959,7 +28959,7 @@
                 <w:rFonts w:ascii="Aptos" w:hAnsi="Aptos"/>
                 <w:sz w:val="16"/>
               </w:rPr>
-              <w:t>experiments/raw-results/atomicbot-turboquant/2026-07-17/quality-all-rows/AB-13/P6.json</w:t>
+              <w:t>experiments/raw-results/retained/atomicbot-turboquant/2026-07-17/quality-all-rows/AB-13/P6.json</w:t>
             </w:r>
           </w:p>
         </w:tc>
@@ -29036,7 +29036,7 @@
                 <w:rFonts w:ascii="Aptos" w:hAnsi="Aptos"/>
                 <w:sz w:val="16"/>
               </w:rPr>
-              <w:t>experiments/raw-results/atomicbot-turboquant/2026-07-17/quality-all-rows/AB-01/P6.json</w:t>
+              <w:t>experiments/raw-results/retained/atomicbot-turboquant/2026-07-17/quality-all-rows/AB-01/P6.json</w:t>
             </w:r>
           </w:p>
         </w:tc>
@@ -29117,7 +29117,7 @@
                 <w:rFonts w:ascii="Aptos" w:hAnsi="Aptos"/>
                 <w:sz w:val="16"/>
               </w:rPr>
-              <w:t>experiments/raw-results/atomicbot-turboquant/2026-07-17/quality-all-rows/AB-15/P6.json</w:t>
+              <w:t>experiments/raw-results/retained/atomicbot-turboquant/2026-07-17/quality-all-rows/AB-15/P6.json</w:t>
             </w:r>
           </w:p>
         </w:tc>
@@ -29194,7 +29194,7 @@
                 <w:rFonts w:ascii="Aptos" w:hAnsi="Aptos"/>
                 <w:sz w:val="16"/>
               </w:rPr>
-              <w:t>experiments/raw-results/atomicbot-turboquant/2026-07-17/quality-all-rows/AB-03/P5.json</w:t>
+              <w:t>experiments/raw-results/retained/atomicbot-turboquant/2026-07-17/quality-all-rows/AB-03/P5.json</w:t>
             </w:r>
           </w:p>
         </w:tc>
@@ -29275,7 +29275,7 @@
                 <w:rFonts w:ascii="Aptos" w:hAnsi="Aptos"/>
                 <w:sz w:val="16"/>
               </w:rPr>
-              <w:t>experiments/raw-results/atomicbot-turboquant/2026-07-17/quality-all-rows/AB-KV3-F16-4K/P6.json</w:t>
+              <w:t>experiments/raw-results/retained/atomicbot-turboquant/2026-07-17/quality-all-rows/AB-KV3-F16-4K/P6.json</w:t>
             </w:r>
           </w:p>
         </w:tc>
@@ -29352,7 +29352,7 @@
                 <w:rFonts w:ascii="Aptos" w:hAnsi="Aptos"/>
                 <w:sz w:val="16"/>
               </w:rPr>
-              <w:t>experiments/raw-results/atomicbot-turboquant/2026-07-17/quality-all-rows/AB-KV3-F16-4K/P5.json</w:t>
+              <w:t>experiments/raw-results/retained/atomicbot-turboquant/2026-07-17/quality-all-rows/AB-KV3-F16-4K/P5.json</w:t>
             </w:r>
           </w:p>
         </w:tc>
@@ -29433,7 +29433,7 @@
                 <w:rFonts w:ascii="Aptos" w:hAnsi="Aptos"/>
                 <w:sz w:val="16"/>
               </w:rPr>
-              <w:t>experiments/raw-results/atomicbot-turboquant/2026-07-17/quality-all-rows/AB-10/P3.json</w:t>
+              <w:t>experiments/raw-results/retained/atomicbot-turboquant/2026-07-17/quality-all-rows/AB-10/P3.json</w:t>
             </w:r>
           </w:p>
         </w:tc>
@@ -29510,7 +29510,7 @@
                 <w:rFonts w:ascii="Aptos" w:hAnsi="Aptos"/>
                 <w:sz w:val="16"/>
               </w:rPr>
-              <w:t>experiments/raw-results/atomicbot-turboquant/2026-07-17/quality-all-rows/AB-07/P5.json</w:t>
+              <w:t>experiments/raw-results/retained/atomicbot-turboquant/2026-07-17/quality-all-rows/AB-07/P5.json</w:t>
             </w:r>
           </w:p>
         </w:tc>
@@ -29591,7 +29591,7 @@
                 <w:rFonts w:ascii="Aptos" w:hAnsi="Aptos"/>
                 <w:sz w:val="16"/>
               </w:rPr>
-              <w:t>experiments/raw-results/atomicbot-turboquant/2026-07-17/quality-all-rows/AB-10/P5.json</w:t>
+              <w:t>experiments/raw-results/retained/atomicbot-turboquant/2026-07-17/quality-all-rows/AB-10/P5.json</w:t>
             </w:r>
           </w:p>
         </w:tc>
@@ -29668,7 +29668,7 @@
                 <w:rFonts w:ascii="Aptos" w:hAnsi="Aptos"/>
                 <w:sz w:val="16"/>
               </w:rPr>
-              <w:t>experiments/raw-results/atomicbot-turboquant/2026-07-17/quality-all-rows/AB-04/P5.json</w:t>
+              <w:t>experiments/raw-results/retained/atomicbot-turboquant/2026-07-17/quality-all-rows/AB-04/P5.json</w:t>
             </w:r>
           </w:p>
         </w:tc>
@@ -29749,7 +29749,7 @@
                 <w:rFonts w:ascii="Aptos" w:hAnsi="Aptos"/>
                 <w:sz w:val="16"/>
               </w:rPr>
-              <w:t>experiments/raw-results/atomicbot-turboquant/2026-07-17/quality-all-rows/AB-14/P2.json</w:t>
+              <w:t>experiments/raw-results/retained/atomicbot-turboquant/2026-07-17/quality-all-rows/AB-14/P2.json</w:t>
             </w:r>
           </w:p>
         </w:tc>
@@ -29826,7 +29826,7 @@
                 <w:rFonts w:ascii="Aptos" w:hAnsi="Aptos"/>
                 <w:sz w:val="16"/>
               </w:rPr>
-              <w:t>experiments/raw-results/atomicbot-turboquant/2026-07-17/quality-all-rows/AB-07/P6.json</w:t>
+              <w:t>experiments/raw-results/retained/atomicbot-turboquant/2026-07-17/quality-all-rows/AB-07/P6.json</w:t>
             </w:r>
           </w:p>
         </w:tc>
@@ -29907,7 +29907,7 @@
                 <w:rFonts w:ascii="Aptos" w:hAnsi="Aptos"/>
                 <w:sz w:val="16"/>
               </w:rPr>
-              <w:t>experiments/raw-results/atomicbot-turboquant/2026-07-17/quality-all-rows/AB-02/P1.json</w:t>
+              <w:t>experiments/raw-results/retained/atomicbot-turboquant/2026-07-17/quality-all-rows/AB-02/P1.json</w:t>
             </w:r>
           </w:p>
         </w:tc>
@@ -29984,7 +29984,7 @@
                 <w:rFonts w:ascii="Aptos" w:hAnsi="Aptos"/>
                 <w:sz w:val="16"/>
               </w:rPr>
-              <w:t>experiments/raw-results/atomicbot-turboquant/2026-07-17/quality-all-rows/AB-01/P5.json</w:t>
+              <w:t>experiments/raw-results/retained/atomicbot-turboquant/2026-07-17/quality-all-rows/AB-01/P5.json</w:t>
             </w:r>
           </w:p>
         </w:tc>
@@ -30065,7 +30065,7 @@
                 <w:rFonts w:ascii="Aptos" w:hAnsi="Aptos"/>
                 <w:sz w:val="16"/>
               </w:rPr>
-              <w:t>experiments/raw-results/atomicbot-turboquant/2026-07-17/quality-all-rows/AB-02/P4.json</w:t>
+              <w:t>experiments/raw-results/retained/atomicbot-turboquant/2026-07-17/quality-all-rows/AB-02/P4.json</w:t>
             </w:r>
           </w:p>
         </w:tc>
@@ -30142,7 +30142,7 @@
                 <w:rFonts w:ascii="Aptos" w:hAnsi="Aptos"/>
                 <w:sz w:val="16"/>
               </w:rPr>
-              <w:t>experiments/raw-results/atomicbot-turboquant/2026-07-17/quality-all-rows/AB-08F/P3.json</w:t>
+              <w:t>experiments/raw-results/retained/atomicbot-turboquant/2026-07-17/quality-all-rows/AB-08F/P3.json</w:t>
             </w:r>
           </w:p>
         </w:tc>
@@ -30223,7 +30223,7 @@
                 <w:rFonts w:ascii="Aptos" w:hAnsi="Aptos"/>
                 <w:sz w:val="16"/>
               </w:rPr>
-              <w:t>experiments/raw-results/atomicbot-turboquant/2026-07-17/quality-all-rows/AB-15/P5.json</w:t>
+              <w:t>experiments/raw-results/retained/atomicbot-turboquant/2026-07-17/quality-all-rows/AB-15/P5.json</w:t>
             </w:r>
           </w:p>
         </w:tc>
@@ -30300,7 +30300,7 @@
                 <w:rFonts w:ascii="Aptos" w:hAnsi="Aptos"/>
                 <w:sz w:val="16"/>
               </w:rPr>
-              <w:t>experiments/raw-results/atomicbot-turboquant/2026-07-17/quality-all-rows/AB-06/P2.json</w:t>
+              <w:t>experiments/raw-results/retained/atomicbot-turboquant/2026-07-17/quality-all-rows/AB-06/P2.json</w:t>
             </w:r>
           </w:p>
         </w:tc>
@@ -30381,7 +30381,7 @@
                 <w:rFonts w:ascii="Aptos" w:hAnsi="Aptos"/>
                 <w:sz w:val="16"/>
               </w:rPr>
-              <w:t>experiments/raw-results/atomicbot-turboquant/2026-07-17/quality-all-rows/AB-07/P2.json</w:t>
+              <w:t>experiments/raw-results/retained/atomicbot-turboquant/2026-07-17/quality-all-rows/AB-07/P2.json</w:t>
             </w:r>
           </w:p>
         </w:tc>
@@ -30458,7 +30458,7 @@
                 <w:rFonts w:ascii="Aptos" w:hAnsi="Aptos"/>
                 <w:sz w:val="16"/>
               </w:rPr>
-              <w:t>experiments/raw-results/atomicbot-turboquant/2026-07-17/quality-all-rows/AB-04/P4.json</w:t>
+              <w:t>experiments/raw-results/retained/atomicbot-turboquant/2026-07-17/quality-all-rows/AB-04/P4.json</w:t>
             </w:r>
           </w:p>
         </w:tc>
@@ -30539,7 +30539,7 @@
                 <w:rFonts w:ascii="Aptos" w:hAnsi="Aptos"/>
                 <w:sz w:val="16"/>
               </w:rPr>
-              <w:t>experiments/raw-results/atomicbot-turboquant/2026-07-17/quality-all-rows/AB-07/P3.json</w:t>
+              <w:t>experiments/raw-results/retained/atomicbot-turboquant/2026-07-17/quality-all-rows/AB-07/P3.json</w:t>
             </w:r>
           </w:p>
         </w:tc>
@@ -30616,7 +30616,7 @@
                 <w:rFonts w:ascii="Aptos" w:hAnsi="Aptos"/>
                 <w:sz w:val="16"/>
               </w:rPr>
-              <w:t>experiments/raw-results/atomicbot-turboquant/2026-07-17/quality-all-rows/AB-08Q/P1.json</w:t>
+              <w:t>experiments/raw-results/retained/atomicbot-turboquant/2026-07-17/quality-all-rows/AB-08Q/P1.json</w:t>
             </w:r>
           </w:p>
         </w:tc>
@@ -30697,7 +30697,7 @@
                 <w:rFonts w:ascii="Aptos" w:hAnsi="Aptos"/>
                 <w:sz w:val="16"/>
               </w:rPr>
-              <w:t>experiments/raw-results/atomicbot-turboquant/2026-07-17/quality-all-rows/AB-15M/P4.json</w:t>
+              <w:t>experiments/raw-results/retained/atomicbot-turboquant/2026-07-17/quality-all-rows/AB-15M/P4.json</w:t>
             </w:r>
           </w:p>
         </w:tc>
@@ -30774,7 +30774,7 @@
                 <w:rFonts w:ascii="Aptos" w:hAnsi="Aptos"/>
                 <w:sz w:val="16"/>
               </w:rPr>
-              <w:t>experiments/raw-results/atomicbot-turboquant/2026-07-17/quality-all-rows/AB-15M/P3.json</w:t>
+              <w:t>experiments/raw-results/retained/atomicbot-turboquant/2026-07-17/quality-all-rows/AB-15M/P3.json</w:t>
             </w:r>
           </w:p>
         </w:tc>
@@ -30855,7 +30855,7 @@
                 <w:rFonts w:ascii="Aptos" w:hAnsi="Aptos"/>
                 <w:sz w:val="16"/>
               </w:rPr>
-              <w:t>experiments/raw-results/atomicbot-turboquant/2026-07-17/quality-all-rows/AB-10/P4.json</w:t>
+              <w:t>experiments/raw-results/retained/atomicbot-turboquant/2026-07-17/quality-all-rows/AB-10/P4.json</w:t>
             </w:r>
           </w:p>
         </w:tc>
@@ -30932,7 +30932,7 @@
                 <w:rFonts w:ascii="Aptos" w:hAnsi="Aptos"/>
                 <w:sz w:val="16"/>
               </w:rPr>
-              <w:t>experiments/raw-results/atomicbot-turboquant/2026-07-17/quality-all-rows/AB-14/P1.json</w:t>
+              <w:t>experiments/raw-results/retained/atomicbot-turboquant/2026-07-17/quality-all-rows/AB-14/P1.json</w:t>
             </w:r>
           </w:p>
         </w:tc>
@@ -31013,7 +31013,7 @@
                 <w:rFonts w:ascii="Aptos" w:hAnsi="Aptos"/>
                 <w:sz w:val="16"/>
               </w:rPr>
-              <w:t>experiments/raw-results/atomicbot-turboquant/2026-07-17/quality-all-rows/AB-KV3-F16-4K/P4.json</w:t>
+              <w:t>experiments/raw-results/retained/atomicbot-turboquant/2026-07-17/quality-all-rows/AB-KV3-F16-4K/P4.json</w:t>
             </w:r>
           </w:p>
         </w:tc>
@@ -31090,7 +31090,7 @@
                 <w:rFonts w:ascii="Aptos" w:hAnsi="Aptos"/>
                 <w:sz w:val="16"/>
               </w:rPr>
-              <w:t>experiments/raw-results/atomicbot-turboquant/2026-07-17/quality-all-rows/AB-08Q/P3.json</w:t>
+              <w:t>experiments/raw-results/retained/atomicbot-turboquant/2026-07-17/quality-all-rows/AB-08Q/P3.json</w:t>
             </w:r>
           </w:p>
         </w:tc>
@@ -31171,7 +31171,7 @@
                 <w:rFonts w:ascii="Aptos" w:hAnsi="Aptos"/>
                 <w:sz w:val="16"/>
               </w:rPr>
-              <w:t>experiments/raw-results/atomicbot-turboquant/2026-07-17/quality-all-rows/AB-12/P2.json</w:t>
+              <w:t>experiments/raw-results/retained/atomicbot-turboquant/2026-07-17/quality-all-rows/AB-12/P2.json</w:t>
             </w:r>
           </w:p>
         </w:tc>
@@ -31248,7 +31248,7 @@
                 <w:rFonts w:ascii="Aptos" w:hAnsi="Aptos"/>
                 <w:sz w:val="16"/>
               </w:rPr>
-              <w:t>experiments/raw-results/atomicbot-turboquant/2026-07-17/quality-all-rows/AB-02/P5.json</w:t>
+              <w:t>experiments/raw-results/retained/atomicbot-turboquant/2026-07-17/quality-all-rows/AB-02/P5.json</w:t>
             </w:r>
           </w:p>
         </w:tc>
@@ -31329,7 +31329,7 @@
                 <w:rFonts w:ascii="Aptos" w:hAnsi="Aptos"/>
                 <w:sz w:val="16"/>
               </w:rPr>
-              <w:t>experiments/raw-results/atomicbot-turboquant/2026-07-17/quality-all-rows/AB-02/P2.json</w:t>
+              <w:t>experiments/raw-results/retained/atomicbot-turboquant/2026-07-17/quality-all-rows/AB-02/P2.json</w:t>
             </w:r>
           </w:p>
         </w:tc>
@@ -31406,7 +31406,7 @@
                 <w:rFonts w:ascii="Aptos" w:hAnsi="Aptos"/>
                 <w:sz w:val="16"/>
               </w:rPr>
-              <w:t>experiments/raw-results/atomicbot-turboquant/2026-07-17/quality-all-rows/AB-03/P2.json</w:t>
+              <w:t>experiments/raw-results/retained/atomicbot-turboquant/2026-07-17/quality-all-rows/AB-03/P2.json</w:t>
             </w:r>
           </w:p>
         </w:tc>
@@ -31487,7 +31487,7 @@
                 <w:rFonts w:ascii="Aptos" w:hAnsi="Aptos"/>
                 <w:sz w:val="16"/>
               </w:rPr>
-              <w:t>experiments/raw-results/atomicbot-turboquant/2026-07-17/quality-all-rows/AB-01/P2.json</w:t>
+              <w:t>experiments/raw-results/retained/atomicbot-turboquant/2026-07-17/quality-all-rows/AB-01/P2.json</w:t>
             </w:r>
           </w:p>
         </w:tc>
@@ -31722,7 +31722,7 @@
                 <w:rFonts w:ascii="Aptos" w:hAnsi="Aptos"/>
                 <w:sz w:val="16"/>
               </w:rPr>
-              <w:t>experiments/raw-results/atomicbot-turboquant/2026-07-17/quality-all-rows/quality-summary.json</w:t>
+              <w:t>experiments/raw-results/retained/atomicbot-turboquant/2026-07-17/quality-all-rows/quality-summary.json</w:t>
             </w:r>
           </w:p>
         </w:tc>
@@ -31803,7 +31803,7 @@
                 <w:rFonts w:ascii="Aptos" w:hAnsi="Aptos"/>
                 <w:sz w:val="16"/>
               </w:rPr>
-              <w:t>experiments/raw-results/atomicbot-turboquant/2026-07-17/all-row-utilization-v1/AB-09/sample-2/measurement.json</w:t>
+              <w:t>experiments/raw-results/retained/atomicbot-turboquant/2026-07-17/all-row-utilization-v1/AB-09/sample-2/measurement.json</w:t>
             </w:r>
           </w:p>
         </w:tc>
@@ -31880,7 +31880,7 @@
                 <w:rFonts w:ascii="Aptos" w:hAnsi="Aptos"/>
                 <w:sz w:val="16"/>
               </w:rPr>
-              <w:t>experiments/raw-results/atomicbot-turboquant/2026-07-17/all-row-utilization-v1/AB-14/sample-1/measurement.json</w:t>
+              <w:t>experiments/raw-results/retained/atomicbot-turboquant/2026-07-17/all-row-utilization-v1/AB-14/sample-1/measurement.json</w:t>
             </w:r>
           </w:p>
         </w:tc>
@@ -31961,7 +31961,7 @@
                 <w:rFonts w:ascii="Aptos" w:hAnsi="Aptos"/>
                 <w:sz w:val="16"/>
               </w:rPr>
-              <w:t>experiments/raw-results/atomicbot-turboquant/2026-07-17/all-row-utilization-v1/AB-15/sample-3/measurement.json</w:t>
+              <w:t>experiments/raw-results/retained/atomicbot-turboquant/2026-07-17/all-row-utilization-v1/AB-15/sample-3/measurement.json</w:t>
             </w:r>
           </w:p>
         </w:tc>
@@ -32038,7 +32038,7 @@
                 <w:rFonts w:ascii="Aptos" w:hAnsi="Aptos"/>
                 <w:sz w:val="16"/>
               </w:rPr>
-              <w:t>experiments/raw-results/atomicbot-turboquant/2026-07-17/all-row-utilization-v1/AB-15M/sample-3/measurement.json</w:t>
+              <w:t>experiments/raw-results/retained/atomicbot-turboquant/2026-07-17/all-row-utilization-v1/AB-15M/sample-3/measurement.json</w:t>
             </w:r>
           </w:p>
         </w:tc>
@@ -32119,7 +32119,7 @@
                 <w:rFonts w:ascii="Aptos" w:hAnsi="Aptos"/>
                 <w:sz w:val="16"/>
               </w:rPr>
-              <w:t>experiments/raw-results/atomicbot-turboquant/2026-07-17/all-row-utilization-v1/AB-11/sample-1/measurement.json</w:t>
+              <w:t>experiments/raw-results/retained/atomicbot-turboquant/2026-07-17/all-row-utilization-v1/AB-11/sample-1/measurement.json</w:t>
             </w:r>
           </w:p>
         </w:tc>
@@ -32196,7 +32196,7 @@
                 <w:rFonts w:ascii="Aptos" w:hAnsi="Aptos"/>
                 <w:sz w:val="16"/>
               </w:rPr>
-              <w:t>experiments/raw-results/atomicbot-turboquant/2026-07-17/all-row-utilization-v1/AB-08F/sample-3/measurement.json</w:t>
+              <w:t>experiments/raw-results/retained/atomicbot-turboquant/2026-07-17/all-row-utilization-v1/AB-08F/sample-3/measurement.json</w:t>
             </w:r>
           </w:p>
         </w:tc>
@@ -32277,7 +32277,7 @@
                 <w:rFonts w:ascii="Aptos" w:hAnsi="Aptos"/>
                 <w:sz w:val="16"/>
               </w:rPr>
-              <w:t>experiments/raw-results/atomicbot-turboquant/2026-07-17/all-row-utilization-v1/AB-KV3-F16-4K/sample-1/measurement.json</w:t>
+              <w:t>experiments/raw-results/retained/atomicbot-turboquant/2026-07-17/all-row-utilization-v1/AB-KV3-F16-4K/sample-1/measurement.json</w:t>
             </w:r>
           </w:p>
         </w:tc>
@@ -32354,7 +32354,7 @@
                 <w:rFonts w:ascii="Aptos" w:hAnsi="Aptos"/>
                 <w:sz w:val="16"/>
               </w:rPr>
-              <w:t>experiments/raw-results/atomicbot-turboquant/2026-07-17/all-row-utilization-v1/AB-08F/sample-2/measurement.json</w:t>
+              <w:t>experiments/raw-results/retained/atomicbot-turboquant/2026-07-17/all-row-utilization-v1/AB-08F/sample-2/measurement.json</w:t>
             </w:r>
           </w:p>
         </w:tc>
@@ -32435,7 +32435,7 @@
                 <w:rFonts w:ascii="Aptos" w:hAnsi="Aptos"/>
                 <w:sz w:val="16"/>
               </w:rPr>
-              <w:t>experiments/raw-results/atomicbot-turboquant/2026-07-17/all-row-utilization-v1/AB-KV8-F16-4K/sample-2/measurement.json</w:t>
+              <w:t>experiments/raw-results/retained/atomicbot-turboquant/2026-07-17/all-row-utilization-v1/AB-KV8-F16-4K/sample-2/measurement.json</w:t>
             </w:r>
           </w:p>
         </w:tc>
@@ -32512,7 +32512,7 @@
                 <w:rFonts w:ascii="Aptos" w:hAnsi="Aptos"/>
                 <w:sz w:val="16"/>
               </w:rPr>
-              <w:t>experiments/raw-results/atomicbot-turboquant/2026-07-17/all-row-utilization-v1/AB-KV3-F16-4K/sample-2/measurement.json</w:t>
+              <w:t>experiments/raw-results/retained/atomicbot-turboquant/2026-07-17/all-row-utilization-v1/AB-KV3-F16-4K/sample-2/measurement.json</w:t>
             </w:r>
           </w:p>
         </w:tc>
@@ -32593,7 +32593,7 @@
                 <w:rFonts w:ascii="Aptos" w:hAnsi="Aptos"/>
                 <w:sz w:val="16"/>
               </w:rPr>
-              <w:t>experiments/raw-results/atomicbot-turboquant/2026-07-17/all-row-utilization-v1/AB-04/sample-3/measurement.json</w:t>
+              <w:t>experiments/raw-results/retained/atomicbot-turboquant/2026-07-17/all-row-utilization-v1/AB-04/sample-3/measurement.json</w:t>
             </w:r>
           </w:p>
         </w:tc>
@@ -32670,7 +32670,7 @@
                 <w:rFonts w:ascii="Aptos" w:hAnsi="Aptos"/>
                 <w:sz w:val="16"/>
               </w:rPr>
-              <w:t>experiments/raw-results/atomicbot-turboquant/2026-07-17/all-row-utilization-v1/AB-KV8-F16-4K/sample-1/measurement.json</w:t>
+              <w:t>experiments/raw-results/retained/atomicbot-turboquant/2026-07-17/all-row-utilization-v1/AB-KV8-F16-4K/sample-1/measurement.json</w:t>
             </w:r>
           </w:p>
         </w:tc>
@@ -32751,7 +32751,7 @@
                 <w:rFonts w:ascii="Aptos" w:hAnsi="Aptos"/>
                 <w:sz w:val="16"/>
               </w:rPr>
-              <w:t>experiments/raw-results/atomicbot-turboquant/2026-07-17/all-row-utilization-v1/AB-11/sample-3/measurement.json</w:t>
+              <w:t>experiments/raw-results/retained/atomicbot-turboquant/2026-07-17/all-row-utilization-v1/AB-11/sample-3/measurement.json</w:t>
             </w:r>
           </w:p>
         </w:tc>
@@ -32828,7 +32828,7 @@
                 <w:rFonts w:ascii="Aptos" w:hAnsi="Aptos"/>
                 <w:sz w:val="16"/>
               </w:rPr>
-              <w:t>experiments/raw-results/atomicbot-turboquant/2026-07-17/all-row-utilization-v1/AB-07/sample-1/measurement.json</w:t>
+              <w:t>experiments/raw-results/retained/atomicbot-turboquant/2026-07-17/all-row-utilization-v1/AB-07/sample-1/measurement.json</w:t>
             </w:r>
           </w:p>
         </w:tc>
@@ -32909,7 +32909,7 @@
                 <w:rFonts w:ascii="Aptos" w:hAnsi="Aptos"/>
                 <w:sz w:val="16"/>
               </w:rPr>
-              <w:t>experiments/raw-results/atomicbot-turboquant/2026-07-17/all-row-utilization-v1/AB-03/sample-2/measurement.json</w:t>
+              <w:t>experiments/raw-results/retained/atomicbot-turboquant/2026-07-17/all-row-utilization-v1/AB-03/sample-2/measurement.json</w:t>
             </w:r>
           </w:p>
         </w:tc>
@@ -32986,7 +32986,7 @@
                 <w:rFonts w:ascii="Aptos" w:hAnsi="Aptos"/>
                 <w:sz w:val="16"/>
               </w:rPr>
-              <w:t>experiments/raw-results/atomicbot-turboquant/2026-07-17/all-row-utilization-v1/AB-05/sample-2/measurement.json</w:t>
+              <w:t>experiments/raw-results/retained/atomicbot-turboquant/2026-07-17/all-row-utilization-v1/AB-05/sample-2/measurement.json</w:t>
             </w:r>
           </w:p>
         </w:tc>
@@ -33067,7 +33067,7 @@
                 <w:rFonts w:ascii="Aptos" w:hAnsi="Aptos"/>
                 <w:sz w:val="16"/>
               </w:rPr>
-              <w:t>experiments/raw-results/atomicbot-turboquant/2026-07-17/all-row-utilization-v1/AB-08F/sample-1/measurement.json</w:t>
+              <w:t>experiments/raw-results/retained/atomicbot-turboquant/2026-07-17/all-row-utilization-v1/AB-08F/sample-1/measurement.json</w:t>
             </w:r>
           </w:p>
         </w:tc>
@@ -33144,7 +33144,7 @@
                 <w:rFonts w:ascii="Aptos" w:hAnsi="Aptos"/>
                 <w:sz w:val="16"/>
               </w:rPr>
-              <w:t>experiments/raw-results/atomicbot-turboquant/2026-07-17/all-row-utilization-v1/AB-14/sample-2/measurement.json</w:t>
+              <w:t>experiments/raw-results/retained/atomicbot-turboquant/2026-07-17/all-row-utilization-v1/AB-14/sample-2/measurement.json</w:t>
             </w:r>
           </w:p>
         </w:tc>
@@ -33225,7 +33225,7 @@
                 <w:rFonts w:ascii="Aptos" w:hAnsi="Aptos"/>
                 <w:sz w:val="16"/>
               </w:rPr>
-              <w:t>experiments/raw-results/atomicbot-turboquant/2026-07-17/all-row-utilization-v1/AB-09/sample-3/measurement.json</w:t>
+              <w:t>experiments/raw-results/retained/atomicbot-turboquant/2026-07-17/all-row-utilization-v1/AB-09/sample-3/measurement.json</w:t>
             </w:r>
           </w:p>
         </w:tc>
@@ -33302,7 +33302,7 @@
                 <w:rFonts w:ascii="Aptos" w:hAnsi="Aptos"/>
                 <w:sz w:val="16"/>
               </w:rPr>
-              <w:t>experiments/raw-results/atomicbot-turboquant/2026-07-17/all-row-utilization-v1/AB-KV3-F16-4K/sample-3/measurement.json</w:t>
+              <w:t>experiments/raw-results/retained/atomicbot-turboquant/2026-07-17/all-row-utilization-v1/AB-KV3-F16-4K/sample-3/measurement.json</w:t>
             </w:r>
           </w:p>
         </w:tc>
@@ -33383,7 +33383,7 @@
                 <w:rFonts w:ascii="Aptos" w:hAnsi="Aptos"/>
                 <w:sz w:val="16"/>
               </w:rPr>
-              <w:t>experiments/raw-results/atomicbot-turboquant/2026-07-17/all-row-utilization-v1/AB-07/sample-3/measurement.json</w:t>
+              <w:t>experiments/raw-results/retained/atomicbot-turboquant/2026-07-17/all-row-utilization-v1/AB-07/sample-3/measurement.json</w:t>
             </w:r>
           </w:p>
         </w:tc>
@@ -33460,7 +33460,7 @@
                 <w:rFonts w:ascii="Aptos" w:hAnsi="Aptos"/>
                 <w:sz w:val="16"/>
               </w:rPr>
-              <w:t>experiments/raw-results/atomicbot-turboquant/2026-07-17/all-row-utilization-v1/AB-10/sample-1/measurement.json</w:t>
+              <w:t>experiments/raw-results/retained/atomicbot-turboquant/2026-07-17/all-row-utilization-v1/AB-10/sample-1/measurement.json</w:t>
             </w:r>
           </w:p>
         </w:tc>
@@ -33541,7 +33541,7 @@
                 <w:rFonts w:ascii="Aptos" w:hAnsi="Aptos"/>
                 <w:sz w:val="16"/>
               </w:rPr>
-              <w:t>experiments/raw-results/atomicbot-turboquant/2026-07-17/all-row-utilization-v1/AB-02/sample-2/measurement.json</w:t>
+              <w:t>experiments/raw-results/retained/atomicbot-turboquant/2026-07-17/all-row-utilization-v1/AB-02/sample-2/measurement.json</w:t>
             </w:r>
           </w:p>
         </w:tc>
@@ -33618,7 +33618,7 @@
                 <w:rFonts w:ascii="Aptos" w:hAnsi="Aptos"/>
                 <w:sz w:val="16"/>
               </w:rPr>
-              <w:t>experiments/raw-results/atomicbot-turboquant/2026-07-17/all-row-utilization-v1/AB-08Q/sample-1/measurement.json</w:t>
+              <w:t>experiments/raw-results/retained/atomicbot-turboquant/2026-07-17/all-row-utilization-v1/AB-08Q/sample-1/measurement.json</w:t>
             </w:r>
           </w:p>
         </w:tc>
@@ -33699,7 +33699,7 @@
                 <w:rFonts w:ascii="Aptos" w:hAnsi="Aptos"/>
                 <w:sz w:val="16"/>
               </w:rPr>
-              <w:t>experiments/raw-results/atomicbot-turboquant/2026-07-17/all-row-utilization-v1/AB-10/sample-3/measurement.json</w:t>
+              <w:t>experiments/raw-results/retained/atomicbot-turboquant/2026-07-17/all-row-utilization-v1/AB-10/sample-3/measurement.json</w:t>
             </w:r>
           </w:p>
         </w:tc>
@@ -33776,7 +33776,7 @@
                 <w:rFonts w:ascii="Aptos" w:hAnsi="Aptos"/>
                 <w:sz w:val="16"/>
               </w:rPr>
-              <w:t>experiments/raw-results/atomicbot-turboquant/2026-07-17/all-row-utilization-v1/AB-12/sample-2/measurement.json</w:t>
+              <w:t>experiments/raw-results/retained/atomicbot-turboquant/2026-07-17/all-row-utilization-v1/AB-12/sample-2/measurement.json</w:t>
             </w:r>
           </w:p>
         </w:tc>
@@ -33857,7 +33857,7 @@
                 <w:rFonts w:ascii="Aptos" w:hAnsi="Aptos"/>
                 <w:sz w:val="16"/>
               </w:rPr>
-              <w:t>experiments/raw-results/atomicbot-turboquant/2026-07-17/all-row-utilization-v1/AB-06/sample-1/measurement.json</w:t>
+              <w:t>experiments/raw-results/retained/atomicbot-turboquant/2026-07-17/all-row-utilization-v1/AB-06/sample-1/measurement.json</w:t>
             </w:r>
           </w:p>
         </w:tc>
@@ -33934,7 +33934,7 @@
                 <w:rFonts w:ascii="Aptos" w:hAnsi="Aptos"/>
                 <w:sz w:val="16"/>
               </w:rPr>
-              <w:t>experiments/raw-results/atomicbot-turboquant/2026-07-17/all-row-utilization-v1/AB-05/sample-3/measurement.json</w:t>
+              <w:t>experiments/raw-results/retained/atomicbot-turboquant/2026-07-17/all-row-utilization-v1/AB-05/sample-3/measurement.json</w:t>
             </w:r>
           </w:p>
         </w:tc>
@@ -34015,7 +34015,7 @@
                 <w:rFonts w:ascii="Aptos" w:hAnsi="Aptos"/>
                 <w:sz w:val="16"/>
               </w:rPr>
-              <w:t>experiments/raw-results/atomicbot-turboquant/2026-07-17/all-row-utilization-v1/AB-13/sample-1/measurement.json</w:t>
+              <w:t>experiments/raw-results/retained/atomicbot-turboquant/2026-07-17/all-row-utilization-v1/AB-13/sample-1/measurement.json</w:t>
             </w:r>
           </w:p>
         </w:tc>
@@ -34092,7 +34092,7 @@
                 <w:rFonts w:ascii="Aptos" w:hAnsi="Aptos"/>
                 <w:sz w:val="16"/>
               </w:rPr>
-              <w:t>experiments/raw-results/atomicbot-turboquant/2026-07-17/all-row-utilization-v1/AB-05/sample-1/measurement.json</w:t>
+              <w:t>experiments/raw-results/retained/atomicbot-turboquant/2026-07-17/all-row-utilization-v1/AB-05/sample-1/measurement.json</w:t>
             </w:r>
           </w:p>
         </w:tc>
@@ -34173,7 +34173,7 @@
                 <w:rFonts w:ascii="Aptos" w:hAnsi="Aptos"/>
                 <w:sz w:val="16"/>
               </w:rPr>
-              <w:t>experiments/raw-results/atomicbot-turboquant/2026-07-17/all-row-utilization-v1/AB-04/sample-1/measurement.json</w:t>
+              <w:t>experiments/raw-results/retained/atomicbot-turboquant/2026-07-17/all-row-utilization-v1/AB-04/sample-1/measurement.json</w:t>
             </w:r>
           </w:p>
         </w:tc>
@@ -34250,7 +34250,7 @@
                 <w:rFonts w:ascii="Aptos" w:hAnsi="Aptos"/>
                 <w:sz w:val="16"/>
               </w:rPr>
-              <w:t>experiments/raw-results/atomicbot-turboquant/2026-07-17/all-row-utilization-v1/AB-02/sample-1/measurement.json</w:t>
+              <w:t>experiments/raw-results/retained/atomicbot-turboquant/2026-07-17/all-row-utilization-v1/AB-02/sample-1/measurement.json</w:t>
             </w:r>
           </w:p>
         </w:tc>
@@ -34331,7 +34331,7 @@
                 <w:rFonts w:ascii="Aptos" w:hAnsi="Aptos"/>
                 <w:sz w:val="16"/>
               </w:rPr>
-              <w:t>experiments/raw-results/atomicbot-turboquant/2026-07-17/all-row-utilization-v1/AB-09/sample-1/measurement.json</w:t>
+              <w:t>experiments/raw-results/retained/atomicbot-turboquant/2026-07-17/all-row-utilization-v1/AB-09/sample-1/measurement.json</w:t>
             </w:r>
           </w:p>
         </w:tc>
@@ -34408,7 +34408,7 @@
                 <w:rFonts w:ascii="Aptos" w:hAnsi="Aptos"/>
                 <w:sz w:val="16"/>
               </w:rPr>
-              <w:t>experiments/raw-results/atomicbot-turboquant/2026-07-17/all-row-utilization-v1/AB-06/sample-3/measurement.json</w:t>
+              <w:t>experiments/raw-results/retained/atomicbot-turboquant/2026-07-17/all-row-utilization-v1/AB-06/sample-3/measurement.json</w:t>
             </w:r>
           </w:p>
         </w:tc>
@@ -34489,7 +34489,7 @@
                 <w:rFonts w:ascii="Aptos" w:hAnsi="Aptos"/>
                 <w:sz w:val="16"/>
               </w:rPr>
-              <w:t>experiments/raw-results/atomicbot-turboquant/2026-07-17/all-row-utilization-v1/AB-03/sample-3/measurement.json</w:t>
+              <w:t>experiments/raw-results/retained/atomicbot-turboquant/2026-07-17/all-row-utilization-v1/AB-03/sample-3/measurement.json</w:t>
             </w:r>
           </w:p>
         </w:tc>
@@ -34566,7 +34566,7 @@
                 <w:rFonts w:ascii="Aptos" w:hAnsi="Aptos"/>
                 <w:sz w:val="16"/>
               </w:rPr>
-              <w:t>experiments/raw-results/atomicbot-turboquant/2026-07-17/all-row-utilization-v1/AB-KV8-F16-4K/sample-3/measurement.json</w:t>
+              <w:t>experiments/raw-results/retained/atomicbot-turboquant/2026-07-17/all-row-utilization-v1/AB-KV8-F16-4K/sample-3/measurement.json</w:t>
             </w:r>
           </w:p>
         </w:tc>
@@ -34647,7 +34647,7 @@
                 <w:rFonts w:ascii="Aptos" w:hAnsi="Aptos"/>
                 <w:sz w:val="16"/>
               </w:rPr>
-              <w:t>experiments/raw-results/atomicbot-turboquant/2026-07-17/all-row-utilization-v1/AB-08Q/sample-3/measurement.json</w:t>
+              <w:t>experiments/raw-results/retained/atomicbot-turboquant/2026-07-17/all-row-utilization-v1/AB-08Q/sample-3/measurement.json</w:t>
             </w:r>
           </w:p>
         </w:tc>
@@ -34724,7 +34724,7 @@
                 <w:rFonts w:ascii="Aptos" w:hAnsi="Aptos"/>
                 <w:sz w:val="16"/>
               </w:rPr>
-              <w:t>experiments/raw-results/atomicbot-turboquant/2026-07-17/all-row-utilization-v1/AB-12/sample-1/measurement.json</w:t>
+              <w:t>experiments/raw-results/retained/atomicbot-turboquant/2026-07-17/all-row-utilization-v1/AB-12/sample-1/measurement.json</w:t>
             </w:r>
           </w:p>
         </w:tc>
@@ -34805,7 +34805,7 @@
                 <w:rFonts w:ascii="Aptos" w:hAnsi="Aptos"/>
                 <w:sz w:val="16"/>
               </w:rPr>
-              <w:t>experiments/raw-results/atomicbot-turboquant/2026-07-17/all-row-utilization-v1/AB-13/sample-2/measurement.json</w:t>
+              <w:t>experiments/raw-results/retained/atomicbot-turboquant/2026-07-17/all-row-utilization-v1/AB-13/sample-2/measurement.json</w:t>
             </w:r>
           </w:p>
         </w:tc>
@@ -34882,7 +34882,7 @@
                 <w:rFonts w:ascii="Aptos" w:hAnsi="Aptos"/>
                 <w:sz w:val="16"/>
               </w:rPr>
-              <w:t>experiments/raw-results/atomicbot-turboquant/2026-07-17/all-row-utilization-v1/AB-02/sample-3/measurement.json</w:t>
+              <w:t>experiments/raw-results/retained/atomicbot-turboquant/2026-07-17/all-row-utilization-v1/AB-02/sample-3/measurement.json</w:t>
             </w:r>
           </w:p>
         </w:tc>
@@ -34963,7 +34963,7 @@
                 <w:rFonts w:ascii="Aptos" w:hAnsi="Aptos"/>
                 <w:sz w:val="16"/>
               </w:rPr>
-              <w:t>experiments/raw-results/atomicbot-turboquant/2026-07-17/all-row-utilization-v1/AB-03/sample-1/measurement.json</w:t>
+              <w:t>experiments/raw-results/retained/atomicbot-turboquant/2026-07-17/all-row-utilization-v1/AB-03/sample-1/measurement.json</w:t>
             </w:r>
           </w:p>
         </w:tc>
@@ -35040,7 +35040,7 @@
                 <w:rFonts w:ascii="Aptos" w:hAnsi="Aptos"/>
                 <w:sz w:val="16"/>
               </w:rPr>
-              <w:t>experiments/raw-results/atomicbot-turboquant/2026-07-17/all-row-utilization-v1/AB-15M/sample-2/measurement.json</w:t>
+              <w:t>experiments/raw-results/retained/atomicbot-turboquant/2026-07-17/all-row-utilization-v1/AB-15M/sample-2/measurement.json</w:t>
             </w:r>
           </w:p>
         </w:tc>
@@ -35121,7 +35121,7 @@
                 <w:rFonts w:ascii="Aptos" w:hAnsi="Aptos"/>
                 <w:sz w:val="16"/>
               </w:rPr>
-              <w:t>experiments/raw-results/atomicbot-turboquant/2026-07-17/all-row-utilization-v1/AB-13/sample-3/measurement.json</w:t>
+              <w:t>experiments/raw-results/retained/atomicbot-turboquant/2026-07-17/all-row-utilization-v1/AB-13/sample-3/measurement.json</w:t>
             </w:r>
           </w:p>
         </w:tc>
@@ -35198,7 +35198,7 @@
                 <w:rFonts w:ascii="Aptos" w:hAnsi="Aptos"/>
                 <w:sz w:val="16"/>
               </w:rPr>
-              <w:t>experiments/raw-results/atomicbot-turboquant/2026-07-17/all-row-utilization-v1/AB-04/sample-2/measurement.json</w:t>
+              <w:t>experiments/raw-results/retained/atomicbot-turboquant/2026-07-17/all-row-utilization-v1/AB-04/sample-2/measurement.json</w:t>
             </w:r>
           </w:p>
         </w:tc>
@@ -35279,7 +35279,7 @@
                 <w:rFonts w:ascii="Aptos" w:hAnsi="Aptos"/>
                 <w:sz w:val="16"/>
               </w:rPr>
-              <w:t>experiments/raw-results/atomicbot-turboquant/2026-07-17/all-row-utilization-v1/AB-08Q/sample-2/measurement.json</w:t>
+              <w:t>experiments/raw-results/retained/atomicbot-turboquant/2026-07-17/all-row-utilization-v1/AB-08Q/sample-2/measurement.json</w:t>
             </w:r>
           </w:p>
         </w:tc>
@@ -35356,7 +35356,7 @@
                 <w:rFonts w:ascii="Aptos" w:hAnsi="Aptos"/>
                 <w:sz w:val="16"/>
               </w:rPr>
-              <w:t>experiments/raw-results/atomicbot-turboquant/2026-07-17/all-row-utilization-v1/AB-11/sample-2/measurement.json</w:t>
+              <w:t>experiments/raw-results/retained/atomicbot-turboquant/2026-07-17/all-row-utilization-v1/AB-11/sample-2/measurement.json</w:t>
             </w:r>
           </w:p>
         </w:tc>
@@ -35437,7 +35437,7 @@
                 <w:rFonts w:ascii="Aptos" w:hAnsi="Aptos"/>
                 <w:sz w:val="16"/>
               </w:rPr>
-              <w:t>experiments/raw-results/atomicbot-turboquant/2026-07-17/all-row-utilization-v1/AB-10/sample-2/measurement.json</w:t>
+              <w:t>experiments/raw-results/retained/atomicbot-turboquant/2026-07-17/all-row-utilization-v1/AB-10/sample-2/measurement.json</w:t>
             </w:r>
           </w:p>
         </w:tc>
@@ -35514,7 +35514,7 @@
                 <w:rFonts w:ascii="Aptos" w:hAnsi="Aptos"/>
                 <w:sz w:val="16"/>
               </w:rPr>
-              <w:t>experiments/raw-results/atomicbot-turboquant/2026-07-17/all-row-utilization-v1/AB-01/sample-1/measurement.json</w:t>
+              <w:t>experiments/raw-results/retained/atomicbot-turboquant/2026-07-17/all-row-utilization-v1/AB-01/sample-1/measurement.json</w:t>
             </w:r>
           </w:p>
         </w:tc>
@@ -35595,7 +35595,7 @@
                 <w:rFonts w:ascii="Aptos" w:hAnsi="Aptos"/>
                 <w:sz w:val="16"/>
               </w:rPr>
-              <w:t>experiments/raw-results/atomicbot-turboquant/2026-07-17/all-row-utilization-v1/AB-12/sample-3/measurement.json</w:t>
+              <w:t>experiments/raw-results/retained/atomicbot-turboquant/2026-07-17/all-row-utilization-v1/AB-12/sample-3/measurement.json</w:t>
             </w:r>
           </w:p>
         </w:tc>
@@ -35672,7 +35672,7 @@
                 <w:rFonts w:ascii="Aptos" w:hAnsi="Aptos"/>
                 <w:sz w:val="16"/>
               </w:rPr>
-              <w:t>experiments/raw-results/atomicbot-turboquant/2026-07-17/all-row-utilization-v1/AB-01/sample-3/measurement.json</w:t>
+              <w:t>experiments/raw-results/retained/atomicbot-turboquant/2026-07-17/all-row-utilization-v1/AB-01/sample-3/measurement.json</w:t>
             </w:r>
           </w:p>
         </w:tc>
@@ -35753,7 +35753,7 @@
                 <w:rFonts w:ascii="Aptos" w:hAnsi="Aptos"/>
                 <w:sz w:val="16"/>
               </w:rPr>
-              <w:t>experiments/raw-results/atomicbot-turboquant/2026-07-17/all-row-utilization-v1/AB-07/sample-2/measurement.json</w:t>
+              <w:t>experiments/raw-results/retained/atomicbot-turboquant/2026-07-17/all-row-utilization-v1/AB-07/sample-2/measurement.json</w:t>
             </w:r>
           </w:p>
         </w:tc>
@@ -35830,7 +35830,7 @@
                 <w:rFonts w:ascii="Aptos" w:hAnsi="Aptos"/>
                 <w:sz w:val="16"/>
               </w:rPr>
-              <w:t>experiments/raw-results/atomicbot-turboquant/2026-07-17/all-row-utilization-v1/AB-01/sample-2/measurement.json</w:t>
+              <w:t>experiments/raw-results/retained/atomicbot-turboquant/2026-07-17/all-row-utilization-v1/AB-01/sample-2/measurement.json</w:t>
             </w:r>
           </w:p>
         </w:tc>
@@ -35911,7 +35911,7 @@
                 <w:rFonts w:ascii="Aptos" w:hAnsi="Aptos"/>
                 <w:sz w:val="16"/>
               </w:rPr>
-              <w:t>experiments/raw-results/atomicbot-turboquant/2026-07-17/all-row-utilization-v1/AB-15M/sample-1/measurement.json</w:t>
+              <w:t>experiments/raw-results/retained/atomicbot-turboquant/2026-07-17/all-row-utilization-v1/AB-15M/sample-1/measurement.json</w:t>
             </w:r>
           </w:p>
         </w:tc>
@@ -35988,7 +35988,7 @@
                 <w:rFonts w:ascii="Aptos" w:hAnsi="Aptos"/>
                 <w:sz w:val="16"/>
               </w:rPr>
-              <w:t>experiments/raw-results/atomicbot-turboquant/2026-07-17/all-row-utilization-v1/AB-15/sample-2/measurement.json</w:t>
+              <w:t>experiments/raw-results/retained/atomicbot-turboquant/2026-07-17/all-row-utilization-v1/AB-15/sample-2/measurement.json</w:t>
             </w:r>
           </w:p>
         </w:tc>
@@ -36069,7 +36069,7 @@
                 <w:rFonts w:ascii="Aptos" w:hAnsi="Aptos"/>
                 <w:sz w:val="16"/>
               </w:rPr>
-              <w:t>experiments/raw-results/atomicbot-turboquant/2026-07-17/all-row-utilization-v1/AB-14/sample-3/measurement.json</w:t>
+              <w:t>experiments/raw-results/retained/atomicbot-turboquant/2026-07-17/all-row-utilization-v1/AB-14/sample-3/measurement.json</w:t>
             </w:r>
           </w:p>
         </w:tc>
@@ -36146,7 +36146,7 @@
                 <w:rFonts w:ascii="Aptos" w:hAnsi="Aptos"/>
                 <w:sz w:val="16"/>
               </w:rPr>
-              <w:t>experiments/raw-results/atomicbot-turboquant/2026-07-17/all-row-utilization-v1/AB-15/sample-1/measurement.json</w:t>
+              <w:t>experiments/raw-results/retained/atomicbot-turboquant/2026-07-17/all-row-utilization-v1/AB-15/sample-1/measurement.json</w:t>
             </w:r>
           </w:p>
         </w:tc>
@@ -36227,7 +36227,7 @@
                 <w:rFonts w:ascii="Aptos" w:hAnsi="Aptos"/>
                 <w:sz w:val="16"/>
               </w:rPr>
-              <w:t>experiments/raw-results/atomicbot-turboquant/2026-07-17/all-row-utilization-v1/AB-06/sample-2/measurement.json</w:t>
+              <w:t>experiments/raw-results/retained/atomicbot-turboquant/2026-07-17/all-row-utilization-v1/AB-06/sample-2/measurement.json</w:t>
             </w:r>
           </w:p>
         </w:tc>

</xml_diff>